<commit_message>
docs: corrigindo as regras de negócio no arquivo da Sprint 5
</commit_message>
<xml_diff>
--- a/docs/Sprint 05- Regra-de-negogio-e-Requisitos-do-Sistema.docx
+++ b/docs/Sprint 05- Regra-de-negogio-e-Requisitos-do-Sistema.docx
@@ -4,7 +4,7 @@
   <w:body>
     <w:p>
       <w:pPr>
-        <w:ind w:firstLine="0"/>
+        <w:ind w:leftChars="300" w:left="720" w:right="1134"/>
         <w:jc w:val="center"/>
         <w:rPr>
           <w:rFonts w:cs="Arial"/>
@@ -27,7 +27,7 @@
     </w:p>
     <w:p>
       <w:pPr>
-        <w:ind w:firstLine="0"/>
+        <w:ind w:leftChars="300" w:left="720" w:right="1134"/>
         <w:jc w:val="center"/>
         <w:rPr>
           <w:rFonts w:cs="Arial"/>
@@ -70,7 +70,7 @@
     </w:p>
     <w:p>
       <w:pPr>
-        <w:ind w:firstLine="0"/>
+        <w:ind w:leftChars="300" w:left="720" w:right="1134"/>
         <w:jc w:val="center"/>
         <w:rPr>
           <w:rFonts w:cs="Arial"/>
@@ -93,7 +93,7 @@
     </w:p>
     <w:p>
       <w:pPr>
-        <w:ind w:firstLine="0"/>
+        <w:ind w:leftChars="300" w:left="720" w:right="1134"/>
         <w:jc w:val="center"/>
         <w:rPr>
           <w:rFonts w:cs="Arial"/>
@@ -116,7 +116,7 @@
     </w:p>
     <w:p>
       <w:pPr>
-        <w:ind w:firstLine="0"/>
+        <w:ind w:leftChars="300" w:left="720" w:right="1134"/>
         <w:jc w:val="center"/>
         <w:rPr>
           <w:rFonts w:cs="Arial"/>
@@ -139,7 +139,7 @@
     </w:p>
     <w:p>
       <w:pPr>
-        <w:ind w:firstLine="0"/>
+        <w:ind w:leftChars="300" w:left="720" w:right="1134"/>
         <w:jc w:val="center"/>
         <w:rPr>
           <w:rFonts w:cs="Arial"/>
@@ -162,7 +162,8 @@
     </w:p>
     <w:p>
       <w:pPr>
-        <w:ind w:firstLine="0"/>
+        <w:ind w:leftChars="300" w:left="720" w:right="1134"/>
+        <w:jc w:val="center"/>
         <w:rPr>
           <w:rFonts w:cs="Arial"/>
           <w:b/>
@@ -174,6 +175,7 @@
     </w:p>
     <w:p>
       <w:pPr>
+        <w:ind w:leftChars="300" w:left="720" w:right="1134"/>
         <w:jc w:val="center"/>
         <w:rPr>
           <w:rFonts w:cs="Arial"/>
@@ -186,6 +188,7 @@
     </w:p>
     <w:p>
       <w:pPr>
+        <w:ind w:leftChars="300" w:left="720" w:right="1134"/>
         <w:jc w:val="center"/>
         <w:rPr>
           <w:rFonts w:cs="Arial"/>
@@ -198,6 +201,7 @@
     </w:p>
     <w:p>
       <w:pPr>
+        <w:ind w:leftChars="300" w:left="720" w:right="1134"/>
         <w:jc w:val="center"/>
         <w:rPr>
           <w:rFonts w:cs="Arial"/>
@@ -210,6 +214,7 @@
     </w:p>
     <w:p>
       <w:pPr>
+        <w:ind w:leftChars="300" w:left="720" w:right="1134"/>
         <w:jc w:val="center"/>
         <w:rPr>
           <w:rFonts w:cs="Arial"/>
@@ -222,6 +227,7 @@
     </w:p>
     <w:p>
       <w:pPr>
+        <w:ind w:leftChars="300" w:left="720" w:right="1134"/>
         <w:jc w:val="center"/>
         <w:rPr>
           <w:rFonts w:cs="Arial"/>
@@ -234,6 +240,7 @@
     </w:p>
     <w:p>
       <w:pPr>
+        <w:ind w:leftChars="300" w:left="720" w:right="1134"/>
         <w:jc w:val="center"/>
         <w:rPr>
           <w:rFonts w:cs="Arial"/>
@@ -246,7 +253,7 @@
     </w:p>
     <w:p>
       <w:pPr>
-        <w:ind w:firstLine="0"/>
+        <w:ind w:leftChars="300" w:left="720" w:right="1134"/>
         <w:jc w:val="center"/>
         <w:rPr>
           <w:rFonts w:cs="Arial"/>
@@ -264,7 +271,7 @@
           <w:sz w:val="28"/>
           <w:szCs w:val="28"/>
         </w:rPr>
-        <w:t>S</w:t>
+        <w:t>SPRINT 0</w:t>
       </w:r>
       <w:r>
         <w:rPr>
@@ -274,7 +281,7 @@
           <w:sz w:val="28"/>
           <w:szCs w:val="28"/>
         </w:rPr>
-        <w:t>PRINT</w:t>
+        <w:t>5</w:t>
       </w:r>
       <w:r>
         <w:rPr>
@@ -284,27 +291,24 @@
           <w:sz w:val="28"/>
           <w:szCs w:val="28"/>
         </w:rPr>
-        <w:t xml:space="preserve"> 0</w:t>
-      </w:r>
-      <w:r>
-        <w:rPr>
-          <w:rFonts w:cs="Arial"/>
-          <w:b/>
-          <w:bCs/>
+        <w:br/>
+      </w:r>
+      <w:r>
+        <w:rPr>
+          <w:rFonts w:cs="Arial"/>
           <w:sz w:val="28"/>
           <w:szCs w:val="28"/>
         </w:rPr>
-        <w:t>5</w:t>
-      </w:r>
-      <w:r>
-        <w:rPr>
-          <w:rFonts w:cs="Arial"/>
-          <w:b/>
-          <w:bCs/>
+        <w:t>Regra de negócio </w:t>
+      </w:r>
+      <w:r>
+        <w:rPr>
+          <w:rFonts w:cs="Arial"/>
           <w:sz w:val="28"/>
           <w:szCs w:val="28"/>
         </w:rPr>
         <w:br/>
+        <w:t>&amp;</w:t>
       </w:r>
       <w:r>
         <w:rPr>
@@ -312,7 +316,7 @@
           <w:sz w:val="28"/>
           <w:szCs w:val="28"/>
         </w:rPr>
-        <w:t>Regra de negócio </w:t>
+        <w:br/>
       </w:r>
       <w:r>
         <w:rPr>
@@ -320,28 +324,38 @@
           <w:sz w:val="28"/>
           <w:szCs w:val="28"/>
         </w:rPr>
-        <w:br/>
-        <w:t>&amp;</w:t>
-      </w:r>
-      <w:r>
-        <w:rPr>
-          <w:rFonts w:cs="Arial"/>
+        <w:t>Requisitos do Sistema</w:t>
+      </w:r>
+    </w:p>
+    <w:p>
+      <w:pPr>
+        <w:ind w:leftChars="300" w:left="720" w:right="1134"/>
+        <w:jc w:val="center"/>
+        <w:rPr>
+          <w:rFonts w:cs="Arial"/>
+          <w:b/>
+          <w:bCs/>
           <w:sz w:val="28"/>
           <w:szCs w:val="28"/>
         </w:rPr>
-        <w:br/>
-      </w:r>
-      <w:r>
-        <w:rPr>
-          <w:rFonts w:cs="Arial"/>
+      </w:pPr>
+    </w:p>
+    <w:p>
+      <w:pPr>
+        <w:ind w:leftChars="300" w:left="720" w:right="1134"/>
+        <w:jc w:val="center"/>
+        <w:rPr>
+          <w:rFonts w:cs="Arial"/>
+          <w:b/>
+          <w:bCs/>
           <w:sz w:val="28"/>
           <w:szCs w:val="28"/>
         </w:rPr>
-        <w:t>Requisitos do Sistema</w:t>
-      </w:r>
-    </w:p>
-    <w:p>
-      <w:pPr>
+      </w:pPr>
+    </w:p>
+    <w:p>
+      <w:pPr>
+        <w:ind w:leftChars="300" w:left="720" w:right="1134"/>
         <w:jc w:val="center"/>
         <w:rPr>
           <w:rFonts w:cs="Arial"/>
@@ -354,6 +368,7 @@
     </w:p>
     <w:p>
       <w:pPr>
+        <w:ind w:leftChars="300" w:left="720" w:right="1134"/>
         <w:jc w:val="center"/>
         <w:rPr>
           <w:rFonts w:cs="Arial"/>
@@ -366,6 +381,7 @@
     </w:p>
     <w:p>
       <w:pPr>
+        <w:ind w:leftChars="300" w:left="720" w:right="1134"/>
         <w:jc w:val="center"/>
         <w:rPr>
           <w:rFonts w:cs="Arial"/>
@@ -378,6 +394,7 @@
     </w:p>
     <w:p>
       <w:pPr>
+        <w:ind w:leftChars="300" w:left="720" w:right="1134"/>
         <w:jc w:val="center"/>
         <w:rPr>
           <w:rFonts w:cs="Arial"/>
@@ -390,6 +407,7 @@
     </w:p>
     <w:p>
       <w:pPr>
+        <w:ind w:leftChars="300" w:left="720" w:right="1134"/>
         <w:jc w:val="center"/>
         <w:rPr>
           <w:rFonts w:cs="Arial"/>
@@ -399,7 +417,11 @@
           <w:szCs w:val="28"/>
         </w:rPr>
       </w:pPr>
-      <w:r>
+    </w:p>
+    <w:p>
+      <w:pPr>
+        <w:ind w:leftChars="300" w:left="720" w:right="1134"/>
+        <w:jc w:val="center"/>
         <w:rPr>
           <w:rFonts w:cs="Arial"/>
           <w:b/>
@@ -407,11 +429,11 @@
           <w:sz w:val="28"/>
           <w:szCs w:val="28"/>
         </w:rPr>
-        <w:t xml:space="preserve">  </w:t>
-      </w:r>
-    </w:p>
-    <w:p>
-      <w:pPr>
+      </w:pPr>
+    </w:p>
+    <w:p>
+      <w:pPr>
+        <w:ind w:leftChars="300" w:left="720" w:right="1134"/>
         <w:jc w:val="center"/>
         <w:rPr>
           <w:rFonts w:cs="Arial"/>
@@ -424,19 +446,16 @@
     </w:p>
     <w:p>
       <w:pPr>
+        <w:ind w:leftChars="300" w:left="720" w:right="1134"/>
         <w:jc w:val="center"/>
         <w:rPr>
-          <w:rFonts w:cs="Arial"/>
           <w:b/>
           <w:bCs/>
           <w:sz w:val="28"/>
           <w:szCs w:val="28"/>
         </w:rPr>
       </w:pPr>
-    </w:p>
-    <w:p>
-      <w:pPr>
-        <w:jc w:val="center"/>
+      <w:r>
         <w:rPr>
           <w:rFonts w:cs="Arial"/>
           <w:b/>
@@ -444,17 +463,8 @@
           <w:sz w:val="28"/>
           <w:szCs w:val="28"/>
         </w:rPr>
-      </w:pPr>
-    </w:p>
-    <w:p>
-      <w:pPr>
-        <w:ind w:firstLine="0"/>
-        <w:jc w:val="center"/>
-        <w:rPr>
-          <w:b/>
-          <w:bCs/>
-        </w:rPr>
-      </w:pPr>
+        <w:t>Sertãozinho</w:t>
+      </w:r>
       <w:r>
         <w:rPr>
           <w:rFonts w:cs="Arial"/>
@@ -463,40 +473,36 @@
           <w:sz w:val="28"/>
           <w:szCs w:val="28"/>
         </w:rPr>
-        <w:t>Sertãozinho</w:t>
-      </w:r>
-      <w:r>
-        <w:rPr>
-          <w:rFonts w:cs="Arial"/>
+        <w:br/>
+      </w:r>
+      <w:r>
+        <w:rPr>
           <w:b/>
           <w:bCs/>
           <w:sz w:val="28"/>
           <w:szCs w:val="28"/>
         </w:rPr>
-        <w:br/>
-      </w:r>
-      <w:r>
-        <w:rPr>
-          <w:b/>
-          <w:bCs/>
-        </w:rPr>
         <w:t>202</w:t>
       </w:r>
       <w:r>
         <w:rPr>
           <w:b/>
           <w:bCs/>
+          <w:sz w:val="28"/>
+          <w:szCs w:val="28"/>
         </w:rPr>
         <w:t>6</w:t>
       </w:r>
     </w:p>
     <w:p>
       <w:pPr>
-        <w:ind w:firstLine="0"/>
+        <w:ind w:leftChars="300" w:left="720" w:right="1134"/>
         <w:jc w:val="center"/>
         <w:rPr>
           <w:b/>
           <w:bCs/>
+          <w:sz w:val="28"/>
+          <w:szCs w:val="28"/>
         </w:rPr>
       </w:pPr>
     </w:p>
@@ -522,980 +528,689 @@
           <w:bCs/>
           <w:szCs w:val="24"/>
         </w:rPr>
+        <w:t xml:space="preserve">Regras de Negócio (RN) </w:t>
+      </w:r>
+    </w:p>
+    <w:p>
+      <w:pPr>
+        <w:ind w:firstLine="0"/>
+        <w:jc w:val="both"/>
+        <w:rPr>
+          <w:rFonts w:cs="Arial"/>
+          <w:b/>
+          <w:bCs/>
+          <w:szCs w:val="24"/>
+        </w:rPr>
+      </w:pPr>
+      <w:r>
+        <w:rPr>
+          <w:rFonts w:cs="Arial"/>
+          <w:b/>
+          <w:bCs/>
+          <w:szCs w:val="24"/>
+        </w:rPr>
+        <w:t xml:space="preserve">RN001 – </w:t>
+      </w:r>
+      <w:r>
+        <w:rPr>
+          <w:rFonts w:cs="Arial"/>
+          <w:b/>
+          <w:bCs/>
+          <w:szCs w:val="24"/>
+        </w:rPr>
+        <w:t>Validação de Cadastro do Paciente</w:t>
+      </w:r>
+    </w:p>
+    <w:p>
+      <w:pPr>
+        <w:ind w:firstLine="0"/>
+        <w:jc w:val="both"/>
+        <w:rPr>
+          <w:rFonts w:cs="Arial"/>
+          <w:szCs w:val="24"/>
+        </w:rPr>
+      </w:pPr>
+      <w:r>
+        <w:rPr>
+          <w:rFonts w:cs="Arial"/>
+          <w:szCs w:val="24"/>
+        </w:rPr>
+        <w:t>O paciente só poderá agendar consultas se possuir cadastro completo e ativo no sistema, com:</w:t>
+      </w:r>
+    </w:p>
+    <w:p>
+      <w:pPr>
+        <w:ind w:firstLine="0"/>
+        <w:jc w:val="both"/>
+        <w:rPr>
+          <w:rFonts w:cs="Arial"/>
+          <w:szCs w:val="24"/>
+        </w:rPr>
+      </w:pPr>
+      <w:r>
+        <w:rPr>
+          <w:rFonts w:cs="Arial"/>
+          <w:szCs w:val="24"/>
+        </w:rPr>
+        <w:t xml:space="preserve">- </w:t>
+      </w:r>
+      <w:r>
+        <w:rPr>
+          <w:rFonts w:cs="Arial"/>
+          <w:szCs w:val="24"/>
+        </w:rPr>
+        <w:t>CPF válido</w:t>
+      </w:r>
+    </w:p>
+    <w:p>
+      <w:pPr>
+        <w:ind w:firstLine="0"/>
+        <w:jc w:val="both"/>
+        <w:rPr>
+          <w:rFonts w:cs="Arial"/>
+          <w:szCs w:val="24"/>
+        </w:rPr>
+      </w:pPr>
+      <w:r>
+        <w:rPr>
+          <w:rFonts w:cs="Arial"/>
+          <w:szCs w:val="24"/>
+        </w:rPr>
+        <w:t xml:space="preserve">- </w:t>
+      </w:r>
+      <w:r>
+        <w:rPr>
+          <w:rFonts w:cs="Arial"/>
+          <w:szCs w:val="24"/>
+        </w:rPr>
+        <w:t>Data de nascimento</w:t>
+      </w:r>
+    </w:p>
+    <w:p>
+      <w:pPr>
+        <w:ind w:firstLine="0"/>
+        <w:jc w:val="both"/>
+        <w:rPr>
+          <w:rFonts w:cs="Arial"/>
+          <w:szCs w:val="24"/>
+        </w:rPr>
+      </w:pPr>
+      <w:r>
+        <w:rPr>
+          <w:rFonts w:cs="Arial"/>
+          <w:szCs w:val="24"/>
+        </w:rPr>
+        <w:t xml:space="preserve">- </w:t>
+      </w:r>
+      <w:r>
+        <w:rPr>
+          <w:rFonts w:cs="Arial"/>
+          <w:szCs w:val="24"/>
+        </w:rPr>
+        <w:t>Telefone e e-mail confirmados</w:t>
+      </w:r>
+    </w:p>
+    <w:p>
+      <w:pPr>
+        <w:ind w:firstLine="0"/>
+        <w:jc w:val="both"/>
+        <w:rPr>
+          <w:rFonts w:cs="Arial"/>
+          <w:szCs w:val="24"/>
+        </w:rPr>
+      </w:pPr>
+      <w:r>
+        <w:rPr>
+          <w:rFonts w:cs="Arial"/>
+          <w:szCs w:val="24"/>
+        </w:rPr>
+        <w:t xml:space="preserve">- </w:t>
+      </w:r>
+      <w:r>
+        <w:rPr>
+          <w:rFonts w:cs="Arial"/>
+          <w:szCs w:val="24"/>
+        </w:rPr>
+        <w:t>Convênio (quando aplicável)</w:t>
+      </w:r>
+    </w:p>
+    <w:p>
+      <w:pPr>
+        <w:ind w:firstLine="0"/>
+        <w:jc w:val="both"/>
+        <w:rPr>
+          <w:rFonts w:cs="Arial"/>
+          <w:b/>
+          <w:bCs/>
+          <w:szCs w:val="24"/>
+        </w:rPr>
+      </w:pPr>
+    </w:p>
+    <w:p>
+      <w:pPr>
+        <w:ind w:firstLine="0"/>
+        <w:jc w:val="both"/>
+        <w:rPr>
+          <w:rFonts w:cs="Arial"/>
+          <w:b/>
+          <w:bCs/>
+          <w:szCs w:val="24"/>
+        </w:rPr>
+      </w:pPr>
+      <w:r>
+        <w:rPr>
+          <w:rFonts w:cs="Arial"/>
+          <w:b/>
+          <w:bCs/>
+          <w:szCs w:val="24"/>
+        </w:rPr>
+        <w:t xml:space="preserve">RN002 – </w:t>
+      </w:r>
+      <w:r>
+        <w:rPr>
+          <w:rFonts w:cs="Arial"/>
+          <w:b/>
+          <w:bCs/>
+          <w:szCs w:val="24"/>
+        </w:rPr>
+        <w:t>Disponibilidade de Agenda Médica</w:t>
+      </w:r>
+    </w:p>
+    <w:p>
+      <w:pPr>
+        <w:ind w:firstLine="0"/>
+        <w:jc w:val="both"/>
+        <w:rPr>
+          <w:rFonts w:cs="Arial"/>
+          <w:szCs w:val="24"/>
+        </w:rPr>
+      </w:pPr>
+      <w:r>
+        <w:rPr>
+          <w:rFonts w:cs="Arial"/>
+          <w:szCs w:val="24"/>
+        </w:rPr>
+        <w:t>O sistema deve permitir agendamento apenas em horários:</w:t>
+      </w:r>
+    </w:p>
+    <w:p>
+      <w:pPr>
+        <w:ind w:firstLine="0"/>
+        <w:jc w:val="both"/>
+        <w:rPr>
+          <w:rFonts w:cs="Arial"/>
+          <w:szCs w:val="24"/>
+        </w:rPr>
+      </w:pPr>
+      <w:r>
+        <w:rPr>
+          <w:rFonts w:cs="Arial"/>
+          <w:szCs w:val="24"/>
+        </w:rPr>
+        <w:t xml:space="preserve">- </w:t>
+      </w:r>
+      <w:r>
+        <w:rPr>
+          <w:rFonts w:cs="Arial"/>
+          <w:szCs w:val="24"/>
+        </w:rPr>
+        <w:t>Disponíveis na agenda do médico</w:t>
+      </w:r>
+      <w:r>
+        <w:rPr>
+          <w:rFonts w:cs="Arial"/>
+          <w:szCs w:val="24"/>
+        </w:rPr>
+        <w:t>;</w:t>
+      </w:r>
+    </w:p>
+    <w:p>
+      <w:pPr>
+        <w:ind w:firstLine="0"/>
+        <w:jc w:val="both"/>
+        <w:rPr>
+          <w:rFonts w:cs="Arial"/>
+          <w:szCs w:val="24"/>
+        </w:rPr>
+      </w:pPr>
+      <w:r>
+        <w:rPr>
+          <w:rFonts w:cs="Arial"/>
+          <w:szCs w:val="24"/>
+        </w:rPr>
+        <w:t xml:space="preserve">- </w:t>
+      </w:r>
+      <w:r>
+        <w:rPr>
+          <w:rFonts w:cs="Arial"/>
+          <w:szCs w:val="24"/>
+        </w:rPr>
+        <w:t>Dentro do horário de funcionamento do hospital</w:t>
+      </w:r>
+      <w:r>
+        <w:rPr>
+          <w:rFonts w:cs="Arial"/>
+          <w:szCs w:val="24"/>
+        </w:rPr>
+        <w:t>;</w:t>
+      </w:r>
+    </w:p>
+    <w:p>
+      <w:pPr>
+        <w:ind w:firstLine="0"/>
+        <w:jc w:val="both"/>
+        <w:rPr>
+          <w:rFonts w:cs="Arial"/>
+          <w:szCs w:val="24"/>
+        </w:rPr>
+      </w:pPr>
+      <w:r>
+        <w:rPr>
+          <w:rFonts w:cs="Arial"/>
+          <w:szCs w:val="24"/>
+        </w:rPr>
+        <w:t xml:space="preserve">- </w:t>
+      </w:r>
+      <w:r>
+        <w:rPr>
+          <w:rFonts w:cs="Arial"/>
+          <w:szCs w:val="24"/>
+        </w:rPr>
+        <w:t>Não coincidentes com feriados ou bloqueios administrativos</w:t>
+      </w:r>
+      <w:r>
+        <w:rPr>
+          <w:rFonts w:cs="Arial"/>
+          <w:szCs w:val="24"/>
+        </w:rPr>
+        <w:t>.</w:t>
+      </w:r>
+    </w:p>
+    <w:p>
+      <w:pPr>
+        <w:pStyle w:val="PargrafodaLista"/>
+        <w:ind w:firstLine="0"/>
+        <w:jc w:val="both"/>
+        <w:rPr>
+          <w:rFonts w:cs="Arial"/>
+          <w:b/>
+          <w:bCs/>
+          <w:szCs w:val="24"/>
+        </w:rPr>
+      </w:pPr>
+    </w:p>
+    <w:p>
+      <w:pPr>
+        <w:ind w:firstLine="0"/>
+        <w:jc w:val="both"/>
+        <w:rPr>
+          <w:rFonts w:cs="Arial"/>
+          <w:b/>
+          <w:bCs/>
+          <w:szCs w:val="24"/>
+        </w:rPr>
+      </w:pPr>
+      <w:r>
+        <w:rPr>
+          <w:rFonts w:cs="Arial"/>
+          <w:b/>
+          <w:bCs/>
+          <w:szCs w:val="24"/>
+        </w:rPr>
+        <w:t xml:space="preserve">RN003 – </w:t>
+      </w:r>
+      <w:r>
+        <w:rPr>
+          <w:rFonts w:cs="Arial"/>
+          <w:b/>
+          <w:bCs/>
+          <w:szCs w:val="24"/>
+        </w:rPr>
+        <w:t>Limite de Agendamentos por Especialidade</w:t>
+      </w:r>
+    </w:p>
+    <w:p>
+      <w:pPr>
+        <w:ind w:firstLine="0"/>
+        <w:jc w:val="both"/>
+        <w:rPr>
+          <w:rFonts w:cs="Arial"/>
+          <w:szCs w:val="24"/>
+        </w:rPr>
+      </w:pPr>
+      <w:r>
+        <w:rPr>
+          <w:rFonts w:cs="Arial"/>
+          <w:szCs w:val="24"/>
+        </w:rPr>
+        <w:t>O paciente poderá ter:</w:t>
+      </w:r>
+    </w:p>
+    <w:p>
+      <w:pPr>
+        <w:ind w:firstLine="0"/>
+        <w:jc w:val="both"/>
+        <w:rPr>
+          <w:rFonts w:cs="Arial"/>
+          <w:szCs w:val="24"/>
+        </w:rPr>
+      </w:pPr>
+      <w:r>
+        <w:rPr>
+          <w:rFonts w:cs="Arial"/>
+          <w:szCs w:val="24"/>
+        </w:rPr>
+        <w:t xml:space="preserve">- </w:t>
+      </w:r>
+      <w:r>
+        <w:rPr>
+          <w:rFonts w:cs="Arial"/>
+          <w:szCs w:val="24"/>
+        </w:rPr>
+        <w:t>No máximo 2 consultas futuras por especialidade</w:t>
+      </w:r>
+    </w:p>
+    <w:p>
+      <w:pPr>
+        <w:ind w:firstLine="0"/>
+        <w:jc w:val="both"/>
+        <w:rPr>
+          <w:rFonts w:cs="Arial"/>
+          <w:szCs w:val="24"/>
+        </w:rPr>
+      </w:pPr>
+      <w:r>
+        <w:rPr>
+          <w:rFonts w:cs="Arial"/>
+          <w:szCs w:val="24"/>
+        </w:rPr>
+        <w:t xml:space="preserve">- </w:t>
+      </w:r>
+      <w:r>
+        <w:rPr>
+          <w:rFonts w:cs="Arial"/>
+          <w:szCs w:val="24"/>
+        </w:rPr>
+        <w:t>Não poderá agendar nova consulta se houver pendência financeira relacionada à mesma especialidade</w:t>
+      </w:r>
+    </w:p>
+    <w:p>
+      <w:pPr>
+        <w:pStyle w:val="PargrafodaLista"/>
+        <w:ind w:firstLine="0"/>
+        <w:jc w:val="both"/>
+        <w:rPr>
+          <w:rFonts w:cs="Arial"/>
+          <w:b/>
+          <w:bCs/>
+          <w:szCs w:val="24"/>
+        </w:rPr>
+      </w:pPr>
+    </w:p>
+    <w:p>
+      <w:pPr>
+        <w:ind w:firstLine="0"/>
+        <w:jc w:val="both"/>
+        <w:rPr>
+          <w:rFonts w:cs="Arial"/>
+          <w:b/>
+          <w:bCs/>
+          <w:szCs w:val="24"/>
+        </w:rPr>
+      </w:pPr>
+      <w:r>
+        <w:rPr>
+          <w:rFonts w:cs="Arial"/>
+          <w:b/>
+          <w:bCs/>
+          <w:szCs w:val="24"/>
+        </w:rPr>
+        <w:t xml:space="preserve">RN004 – </w:t>
+      </w:r>
+      <w:r>
+        <w:rPr>
+          <w:rFonts w:cs="Arial"/>
+          <w:b/>
+          <w:bCs/>
+          <w:szCs w:val="24"/>
+        </w:rPr>
+        <w:t>Política de Cancelamento</w:t>
+      </w:r>
+    </w:p>
+    <w:p>
+      <w:pPr>
+        <w:ind w:firstLine="0"/>
+        <w:jc w:val="both"/>
+        <w:rPr>
+          <w:rFonts w:cs="Arial"/>
+          <w:szCs w:val="24"/>
+        </w:rPr>
+      </w:pPr>
+      <w:r>
+        <w:rPr>
+          <w:rFonts w:cs="Arial"/>
+          <w:szCs w:val="24"/>
+        </w:rPr>
+        <w:t>O cancelamento deverá ser realizado com no mínimo:</w:t>
+      </w:r>
+    </w:p>
+    <w:p>
+      <w:pPr>
+        <w:ind w:firstLine="0"/>
+        <w:jc w:val="both"/>
+        <w:rPr>
+          <w:rFonts w:cs="Arial"/>
+          <w:szCs w:val="24"/>
+        </w:rPr>
+      </w:pPr>
+      <w:r>
+        <w:rPr>
+          <w:rFonts w:cs="Arial"/>
+          <w:szCs w:val="24"/>
+        </w:rPr>
+        <w:t xml:space="preserve">- </w:t>
+      </w:r>
+      <w:r>
+        <w:rPr>
+          <w:rFonts w:cs="Arial"/>
+          <w:szCs w:val="24"/>
+        </w:rPr>
+        <w:t>24 horas de antecedência</w:t>
+      </w:r>
+    </w:p>
+    <w:p>
+      <w:pPr>
+        <w:ind w:firstLine="0"/>
+        <w:jc w:val="both"/>
+        <w:rPr>
+          <w:rFonts w:cs="Arial"/>
+          <w:szCs w:val="24"/>
+        </w:rPr>
+      </w:pPr>
+      <w:r>
+        <w:rPr>
+          <w:rFonts w:cs="Arial"/>
+          <w:szCs w:val="24"/>
+        </w:rPr>
+        <w:t>Caso contrário:</w:t>
+      </w:r>
+    </w:p>
+    <w:p>
+      <w:pPr>
+        <w:ind w:firstLine="0"/>
+        <w:jc w:val="both"/>
+        <w:rPr>
+          <w:rFonts w:cs="Arial"/>
+          <w:szCs w:val="24"/>
+        </w:rPr>
+      </w:pPr>
+      <w:r>
+        <w:rPr>
+          <w:rFonts w:cs="Arial"/>
+          <w:szCs w:val="24"/>
+        </w:rPr>
+        <w:t xml:space="preserve">- </w:t>
+      </w:r>
+      <w:r>
+        <w:rPr>
+          <w:rFonts w:cs="Arial"/>
+          <w:szCs w:val="24"/>
+        </w:rPr>
+        <w:t>Poderá ser aplicada taxa de ausência</w:t>
+      </w:r>
+    </w:p>
+    <w:p>
+      <w:pPr>
+        <w:ind w:firstLine="0"/>
+        <w:jc w:val="both"/>
+        <w:rPr>
+          <w:rFonts w:cs="Arial"/>
+          <w:szCs w:val="24"/>
+        </w:rPr>
+      </w:pPr>
+      <w:r>
+        <w:rPr>
+          <w:rFonts w:cs="Arial"/>
+          <w:szCs w:val="24"/>
+        </w:rPr>
+        <w:t xml:space="preserve">- </w:t>
+      </w:r>
+      <w:r>
+        <w:rPr>
+          <w:rFonts w:cs="Arial"/>
+          <w:szCs w:val="24"/>
+        </w:rPr>
+        <w:t>O paciente poderá ter restrição temporária de novos agendamentos</w:t>
+      </w:r>
+    </w:p>
+    <w:p>
+      <w:pPr>
+        <w:pStyle w:val="PargrafodaLista"/>
+        <w:ind w:firstLine="0"/>
+        <w:jc w:val="both"/>
+        <w:rPr>
+          <w:rFonts w:cs="Arial"/>
+          <w:b/>
+          <w:bCs/>
+          <w:szCs w:val="24"/>
+        </w:rPr>
+      </w:pPr>
+    </w:p>
+    <w:p>
+      <w:pPr>
+        <w:ind w:firstLine="0"/>
+        <w:jc w:val="both"/>
+        <w:rPr>
+          <w:rFonts w:cs="Arial"/>
+          <w:b/>
+          <w:bCs/>
+          <w:szCs w:val="24"/>
+        </w:rPr>
+      </w:pPr>
+      <w:r>
+        <w:rPr>
+          <w:rFonts w:cs="Arial"/>
+          <w:b/>
+          <w:bCs/>
+          <w:szCs w:val="24"/>
+        </w:rPr>
+        <w:t xml:space="preserve">RN005 – </w:t>
+      </w:r>
+      <w:r>
+        <w:rPr>
+          <w:rFonts w:cs="Arial"/>
+          <w:b/>
+          <w:bCs/>
+          <w:szCs w:val="24"/>
+        </w:rPr>
+        <w:t>Confirmação Obrigatória da Consulta</w:t>
+      </w:r>
+    </w:p>
+    <w:p>
+      <w:pPr>
+        <w:ind w:firstLine="0"/>
+        <w:jc w:val="both"/>
+        <w:rPr>
+          <w:rFonts w:cs="Arial"/>
+          <w:szCs w:val="24"/>
+        </w:rPr>
+      </w:pPr>
+      <w:r>
+        <w:rPr>
+          <w:rFonts w:cs="Arial"/>
+          <w:szCs w:val="24"/>
+        </w:rPr>
+        <w:t>O paciente deverá confirmar a consulta via:</w:t>
+      </w:r>
+    </w:p>
+    <w:p>
+      <w:pPr>
+        <w:ind w:firstLine="0"/>
+        <w:jc w:val="both"/>
+        <w:rPr>
+          <w:rFonts w:cs="Arial"/>
+          <w:szCs w:val="24"/>
+        </w:rPr>
+      </w:pPr>
+      <w:r>
+        <w:rPr>
+          <w:rFonts w:cs="Arial"/>
+          <w:szCs w:val="24"/>
+        </w:rPr>
+        <w:t xml:space="preserve">- </w:t>
+      </w:r>
+      <w:r>
+        <w:rPr>
+          <w:rFonts w:cs="Arial"/>
+          <w:szCs w:val="24"/>
+        </w:rPr>
+        <w:t>E-mail</w:t>
+      </w:r>
+    </w:p>
+    <w:p>
+      <w:pPr>
+        <w:ind w:firstLine="0"/>
+        <w:jc w:val="both"/>
+        <w:rPr>
+          <w:rFonts w:cs="Arial"/>
+          <w:szCs w:val="24"/>
+        </w:rPr>
+      </w:pPr>
+      <w:r>
+        <w:rPr>
+          <w:rFonts w:cs="Arial"/>
+          <w:szCs w:val="24"/>
+        </w:rPr>
+        <w:t xml:space="preserve">- </w:t>
+      </w:r>
+      <w:r>
+        <w:rPr>
+          <w:rFonts w:cs="Arial"/>
+          <w:szCs w:val="24"/>
+        </w:rPr>
+        <w:t>SMS</w:t>
+      </w:r>
+    </w:p>
+    <w:p>
+      <w:pPr>
+        <w:ind w:firstLine="0"/>
+        <w:jc w:val="both"/>
+        <w:rPr>
+          <w:rFonts w:cs="Arial"/>
+          <w:szCs w:val="24"/>
+        </w:rPr>
+      </w:pPr>
+      <w:r>
+        <w:rPr>
+          <w:rFonts w:cs="Arial"/>
+          <w:szCs w:val="24"/>
+        </w:rPr>
         <w:lastRenderedPageBreak/>
-        <w:t xml:space="preserve">Regras de Negócio (RN) </w:t>
-      </w:r>
-    </w:p>
-    <w:p>
-      <w:pPr>
-        <w:pStyle w:val="PargrafodaLista"/>
-        <w:ind w:firstLine="0"/>
-        <w:jc w:val="both"/>
-        <w:rPr>
-          <w:rFonts w:cs="Arial"/>
-          <w:b/>
-          <w:bCs/>
-          <w:szCs w:val="24"/>
-        </w:rPr>
-      </w:pPr>
-      <w:r>
-        <w:rPr>
-          <w:rFonts w:cs="Arial"/>
-          <w:b/>
-          <w:bCs/>
-          <w:szCs w:val="24"/>
-        </w:rPr>
-        <w:t>1️</w:t>
-      </w:r>
-      <w:r>
-        <w:rPr>
-          <w:rFonts w:ascii="Segoe UI Symbol" w:hAnsi="Segoe UI Symbol" w:cs="Segoe UI Symbol"/>
-          <w:b/>
-          <w:bCs/>
-          <w:szCs w:val="24"/>
-        </w:rPr>
-        <w:t>⃣</w:t>
-      </w:r>
-      <w:r>
-        <w:rPr>
-          <w:rFonts w:cs="Arial"/>
-          <w:b/>
-          <w:bCs/>
-          <w:szCs w:val="24"/>
-        </w:rPr>
-        <w:t xml:space="preserve"> Validação de Cadastro do Paciente</w:t>
-      </w:r>
-    </w:p>
-    <w:p>
-      <w:pPr>
-        <w:pStyle w:val="PargrafodaLista"/>
-        <w:ind w:firstLine="0"/>
-        <w:jc w:val="both"/>
-        <w:rPr>
-          <w:rFonts w:cs="Arial"/>
-          <w:b/>
-          <w:bCs/>
-          <w:szCs w:val="24"/>
-        </w:rPr>
-      </w:pPr>
-    </w:p>
-    <w:p>
-      <w:pPr>
-        <w:pStyle w:val="PargrafodaLista"/>
-        <w:ind w:firstLine="0"/>
-        <w:jc w:val="both"/>
-        <w:rPr>
-          <w:rFonts w:cs="Arial"/>
-          <w:b/>
-          <w:bCs/>
-          <w:szCs w:val="24"/>
-        </w:rPr>
-      </w:pPr>
-      <w:r>
-        <w:rPr>
-          <w:rFonts w:cs="Arial"/>
-          <w:b/>
-          <w:bCs/>
-          <w:szCs w:val="24"/>
-        </w:rPr>
-        <w:t>O paciente só poderá agendar consultas se possuir cadastro completo e ativo no sistema, com:</w:t>
-      </w:r>
-    </w:p>
-    <w:p>
-      <w:pPr>
-        <w:pStyle w:val="PargrafodaLista"/>
-        <w:ind w:firstLine="0"/>
-        <w:jc w:val="both"/>
-        <w:rPr>
-          <w:rFonts w:cs="Arial"/>
-          <w:b/>
-          <w:bCs/>
-          <w:szCs w:val="24"/>
-        </w:rPr>
-      </w:pPr>
-    </w:p>
-    <w:p>
-      <w:pPr>
-        <w:pStyle w:val="PargrafodaLista"/>
-        <w:ind w:firstLine="0"/>
-        <w:jc w:val="both"/>
-        <w:rPr>
-          <w:rFonts w:cs="Arial"/>
-          <w:b/>
-          <w:bCs/>
-          <w:szCs w:val="24"/>
-        </w:rPr>
-      </w:pPr>
-      <w:r>
-        <w:rPr>
-          <w:rFonts w:cs="Arial"/>
-          <w:b/>
-          <w:bCs/>
-          <w:szCs w:val="24"/>
-        </w:rPr>
-        <w:t>CPF válido</w:t>
-      </w:r>
-    </w:p>
-    <w:p>
-      <w:pPr>
-        <w:pStyle w:val="PargrafodaLista"/>
-        <w:ind w:firstLine="0"/>
-        <w:jc w:val="both"/>
-        <w:rPr>
-          <w:rFonts w:cs="Arial"/>
-          <w:b/>
-          <w:bCs/>
-          <w:szCs w:val="24"/>
-        </w:rPr>
-      </w:pPr>
-    </w:p>
-    <w:p>
-      <w:pPr>
-        <w:pStyle w:val="PargrafodaLista"/>
-        <w:ind w:firstLine="0"/>
-        <w:jc w:val="both"/>
-        <w:rPr>
-          <w:rFonts w:cs="Arial"/>
-          <w:b/>
-          <w:bCs/>
-          <w:szCs w:val="24"/>
-        </w:rPr>
-      </w:pPr>
-      <w:r>
-        <w:rPr>
-          <w:rFonts w:cs="Arial"/>
-          <w:b/>
-          <w:bCs/>
-          <w:szCs w:val="24"/>
-        </w:rPr>
-        <w:t>Data de nascimento</w:t>
-      </w:r>
-    </w:p>
-    <w:p>
-      <w:pPr>
-        <w:pStyle w:val="PargrafodaLista"/>
-        <w:ind w:firstLine="0"/>
-        <w:jc w:val="both"/>
-        <w:rPr>
-          <w:rFonts w:cs="Arial"/>
-          <w:b/>
-          <w:bCs/>
-          <w:szCs w:val="24"/>
-        </w:rPr>
-      </w:pPr>
-    </w:p>
-    <w:p>
-      <w:pPr>
-        <w:pStyle w:val="PargrafodaLista"/>
-        <w:ind w:firstLine="0"/>
-        <w:jc w:val="both"/>
-        <w:rPr>
-          <w:rFonts w:cs="Arial"/>
-          <w:b/>
-          <w:bCs/>
-          <w:szCs w:val="24"/>
-        </w:rPr>
-      </w:pPr>
-      <w:r>
-        <w:rPr>
-          <w:rFonts w:cs="Arial"/>
-          <w:b/>
-          <w:bCs/>
-          <w:szCs w:val="24"/>
-        </w:rPr>
-        <w:t>Telefone e e-mail confirmados</w:t>
-      </w:r>
-    </w:p>
-    <w:p>
-      <w:pPr>
-        <w:pStyle w:val="PargrafodaLista"/>
-        <w:ind w:firstLine="0"/>
-        <w:jc w:val="both"/>
-        <w:rPr>
-          <w:rFonts w:cs="Arial"/>
-          <w:b/>
-          <w:bCs/>
-          <w:szCs w:val="24"/>
-        </w:rPr>
-      </w:pPr>
-    </w:p>
-    <w:p>
-      <w:pPr>
-        <w:pStyle w:val="PargrafodaLista"/>
-        <w:ind w:firstLine="0"/>
-        <w:jc w:val="both"/>
-        <w:rPr>
-          <w:rFonts w:cs="Arial"/>
-          <w:b/>
-          <w:bCs/>
-          <w:szCs w:val="24"/>
-        </w:rPr>
-      </w:pPr>
-      <w:r>
-        <w:rPr>
-          <w:rFonts w:cs="Arial"/>
-          <w:b/>
-          <w:bCs/>
-          <w:szCs w:val="24"/>
-        </w:rPr>
-        <w:t>Convênio (quando aplicável)</w:t>
-      </w:r>
-    </w:p>
-    <w:p>
-      <w:pPr>
-        <w:pStyle w:val="PargrafodaLista"/>
-        <w:ind w:firstLine="0"/>
-        <w:jc w:val="both"/>
-        <w:rPr>
-          <w:rFonts w:cs="Arial"/>
-          <w:b/>
-          <w:bCs/>
-          <w:szCs w:val="24"/>
-        </w:rPr>
-      </w:pPr>
-    </w:p>
-    <w:p>
-      <w:pPr>
-        <w:pStyle w:val="PargrafodaLista"/>
-        <w:ind w:firstLine="0"/>
-        <w:jc w:val="both"/>
-        <w:rPr>
-          <w:rFonts w:cs="Arial"/>
-          <w:b/>
-          <w:bCs/>
-          <w:szCs w:val="24"/>
-        </w:rPr>
-      </w:pPr>
-      <w:r>
-        <w:rPr>
-          <w:rFonts w:cs="Arial"/>
-          <w:b/>
-          <w:bCs/>
-          <w:szCs w:val="24"/>
-        </w:rPr>
-        <w:t>2️</w:t>
-      </w:r>
-      <w:r>
-        <w:rPr>
-          <w:rFonts w:ascii="Segoe UI Symbol" w:hAnsi="Segoe UI Symbol" w:cs="Segoe UI Symbol"/>
-          <w:b/>
-          <w:bCs/>
-          <w:szCs w:val="24"/>
-        </w:rPr>
-        <w:t>⃣</w:t>
-      </w:r>
-      <w:r>
-        <w:rPr>
-          <w:rFonts w:cs="Arial"/>
-          <w:b/>
-          <w:bCs/>
-          <w:szCs w:val="24"/>
-        </w:rPr>
-        <w:t xml:space="preserve"> Disponibilidade de Agenda Médica</w:t>
-      </w:r>
-    </w:p>
-    <w:p>
-      <w:pPr>
-        <w:pStyle w:val="PargrafodaLista"/>
-        <w:ind w:firstLine="0"/>
-        <w:jc w:val="both"/>
-        <w:rPr>
-          <w:rFonts w:cs="Arial"/>
-          <w:b/>
-          <w:bCs/>
-          <w:szCs w:val="24"/>
-        </w:rPr>
-      </w:pPr>
-    </w:p>
-    <w:p>
-      <w:pPr>
-        <w:pStyle w:val="PargrafodaLista"/>
-        <w:ind w:firstLine="0"/>
-        <w:jc w:val="both"/>
-        <w:rPr>
-          <w:rFonts w:cs="Arial"/>
-          <w:b/>
-          <w:bCs/>
-          <w:szCs w:val="24"/>
-        </w:rPr>
-      </w:pPr>
-      <w:r>
-        <w:rPr>
-          <w:rFonts w:cs="Arial"/>
-          <w:b/>
-          <w:bCs/>
-          <w:szCs w:val="24"/>
-        </w:rPr>
-        <w:t>O sistema deve permitir agendamento apenas em horários:</w:t>
-      </w:r>
-    </w:p>
-    <w:p>
-      <w:pPr>
-        <w:pStyle w:val="PargrafodaLista"/>
-        <w:ind w:firstLine="0"/>
-        <w:jc w:val="both"/>
-        <w:rPr>
-          <w:rFonts w:cs="Arial"/>
-          <w:b/>
-          <w:bCs/>
-          <w:szCs w:val="24"/>
-        </w:rPr>
-      </w:pPr>
-    </w:p>
-    <w:p>
-      <w:pPr>
-        <w:pStyle w:val="PargrafodaLista"/>
-        <w:ind w:firstLine="0"/>
-        <w:jc w:val="both"/>
-        <w:rPr>
-          <w:rFonts w:cs="Arial"/>
-          <w:b/>
-          <w:bCs/>
-          <w:szCs w:val="24"/>
-        </w:rPr>
-      </w:pPr>
-      <w:r>
-        <w:rPr>
-          <w:rFonts w:cs="Arial"/>
-          <w:b/>
-          <w:bCs/>
-          <w:szCs w:val="24"/>
-        </w:rPr>
-        <w:t>Disponíveis na agenda do médico</w:t>
-      </w:r>
-    </w:p>
-    <w:p>
-      <w:pPr>
-        <w:pStyle w:val="PargrafodaLista"/>
-        <w:ind w:firstLine="0"/>
-        <w:jc w:val="both"/>
-        <w:rPr>
-          <w:rFonts w:cs="Arial"/>
-          <w:b/>
-          <w:bCs/>
-          <w:szCs w:val="24"/>
-        </w:rPr>
-      </w:pPr>
-    </w:p>
-    <w:p>
-      <w:pPr>
-        <w:pStyle w:val="PargrafodaLista"/>
-        <w:ind w:firstLine="0"/>
-        <w:jc w:val="both"/>
-        <w:rPr>
-          <w:rFonts w:cs="Arial"/>
-          <w:b/>
-          <w:bCs/>
-          <w:szCs w:val="24"/>
-        </w:rPr>
-      </w:pPr>
-      <w:r>
-        <w:rPr>
-          <w:rFonts w:cs="Arial"/>
-          <w:b/>
-          <w:bCs/>
-          <w:szCs w:val="24"/>
-        </w:rPr>
-        <w:t>Dentro do horário de funcionamento do hospital</w:t>
-      </w:r>
-    </w:p>
-    <w:p>
-      <w:pPr>
-        <w:pStyle w:val="PargrafodaLista"/>
-        <w:ind w:firstLine="0"/>
-        <w:jc w:val="both"/>
-        <w:rPr>
-          <w:rFonts w:cs="Arial"/>
-          <w:b/>
-          <w:bCs/>
-          <w:szCs w:val="24"/>
-        </w:rPr>
-      </w:pPr>
-    </w:p>
-    <w:p>
-      <w:pPr>
-        <w:pStyle w:val="PargrafodaLista"/>
-        <w:ind w:firstLine="0"/>
-        <w:jc w:val="both"/>
-        <w:rPr>
-          <w:rFonts w:cs="Arial"/>
-          <w:b/>
-          <w:bCs/>
-          <w:szCs w:val="24"/>
-        </w:rPr>
-      </w:pPr>
-      <w:r>
-        <w:rPr>
-          <w:rFonts w:cs="Arial"/>
-          <w:b/>
-          <w:bCs/>
-          <w:szCs w:val="24"/>
-        </w:rPr>
-        <w:t>Não coincidentes com feriados ou bloqueios administrativos</w:t>
-      </w:r>
-    </w:p>
-    <w:p>
-      <w:pPr>
-        <w:pStyle w:val="PargrafodaLista"/>
-        <w:ind w:firstLine="0"/>
-        <w:jc w:val="both"/>
-        <w:rPr>
-          <w:rFonts w:cs="Arial"/>
-          <w:b/>
-          <w:bCs/>
-          <w:szCs w:val="24"/>
-        </w:rPr>
-      </w:pPr>
-    </w:p>
-    <w:p>
-      <w:pPr>
-        <w:pStyle w:val="PargrafodaLista"/>
-        <w:ind w:firstLine="0"/>
-        <w:jc w:val="both"/>
-        <w:rPr>
-          <w:rFonts w:cs="Arial"/>
-          <w:b/>
-          <w:bCs/>
-          <w:szCs w:val="24"/>
-        </w:rPr>
-      </w:pPr>
-      <w:r>
-        <w:rPr>
-          <w:rFonts w:cs="Arial"/>
-          <w:b/>
-          <w:bCs/>
-          <w:szCs w:val="24"/>
-        </w:rPr>
-        <w:t>3️</w:t>
-      </w:r>
-      <w:r>
-        <w:rPr>
-          <w:rFonts w:ascii="Segoe UI Symbol" w:hAnsi="Segoe UI Symbol" w:cs="Segoe UI Symbol"/>
-          <w:b/>
-          <w:bCs/>
-          <w:szCs w:val="24"/>
-        </w:rPr>
-        <w:t>⃣</w:t>
-      </w:r>
-      <w:r>
-        <w:rPr>
-          <w:rFonts w:cs="Arial"/>
-          <w:b/>
-          <w:bCs/>
-          <w:szCs w:val="24"/>
-        </w:rPr>
-        <w:t xml:space="preserve"> Limite de Agendamentos por Especialidade</w:t>
-      </w:r>
-    </w:p>
-    <w:p>
-      <w:pPr>
-        <w:pStyle w:val="PargrafodaLista"/>
-        <w:ind w:firstLine="0"/>
-        <w:jc w:val="both"/>
-        <w:rPr>
-          <w:rFonts w:cs="Arial"/>
-          <w:b/>
-          <w:bCs/>
-          <w:szCs w:val="24"/>
-        </w:rPr>
-      </w:pPr>
-    </w:p>
-    <w:p>
-      <w:pPr>
-        <w:pStyle w:val="PargrafodaLista"/>
-        <w:ind w:firstLine="0"/>
-        <w:jc w:val="both"/>
-        <w:rPr>
-          <w:rFonts w:cs="Arial"/>
-          <w:b/>
-          <w:bCs/>
-          <w:szCs w:val="24"/>
-        </w:rPr>
-      </w:pPr>
-      <w:r>
-        <w:rPr>
-          <w:rFonts w:cs="Arial"/>
-          <w:b/>
-          <w:bCs/>
-          <w:szCs w:val="24"/>
-        </w:rPr>
-        <w:t>O paciente poderá ter:</w:t>
-      </w:r>
-    </w:p>
-    <w:p>
-      <w:pPr>
-        <w:pStyle w:val="PargrafodaLista"/>
-        <w:ind w:firstLine="0"/>
-        <w:jc w:val="both"/>
-        <w:rPr>
-          <w:rFonts w:cs="Arial"/>
-          <w:b/>
-          <w:bCs/>
-          <w:szCs w:val="24"/>
-        </w:rPr>
-      </w:pPr>
-    </w:p>
-    <w:p>
-      <w:pPr>
-        <w:pStyle w:val="PargrafodaLista"/>
-        <w:ind w:firstLine="0"/>
-        <w:jc w:val="both"/>
-        <w:rPr>
-          <w:rFonts w:cs="Arial"/>
-          <w:b/>
-          <w:bCs/>
-          <w:szCs w:val="24"/>
-        </w:rPr>
-      </w:pPr>
-      <w:r>
-        <w:rPr>
-          <w:rFonts w:cs="Arial"/>
-          <w:b/>
-          <w:bCs/>
-          <w:szCs w:val="24"/>
-        </w:rPr>
-        <w:t>No máximo 2 consultas futuras por especialidade</w:t>
-      </w:r>
-    </w:p>
-    <w:p>
-      <w:pPr>
-        <w:pStyle w:val="PargrafodaLista"/>
-        <w:ind w:firstLine="0"/>
-        <w:jc w:val="both"/>
-        <w:rPr>
-          <w:rFonts w:cs="Arial"/>
-          <w:b/>
-          <w:bCs/>
-          <w:szCs w:val="24"/>
-        </w:rPr>
-      </w:pPr>
-    </w:p>
-    <w:p>
-      <w:pPr>
-        <w:pStyle w:val="PargrafodaLista"/>
-        <w:ind w:firstLine="0"/>
-        <w:jc w:val="both"/>
-        <w:rPr>
-          <w:rFonts w:cs="Arial"/>
-          <w:b/>
-          <w:bCs/>
-          <w:szCs w:val="24"/>
-        </w:rPr>
-      </w:pPr>
-      <w:r>
-        <w:rPr>
-          <w:rFonts w:cs="Arial"/>
-          <w:b/>
-          <w:bCs/>
-          <w:szCs w:val="24"/>
-        </w:rPr>
-        <w:t>Não poderá agendar nova consulta se houver pendência financeira relacionada à mesma especialidade</w:t>
-      </w:r>
-    </w:p>
-    <w:p>
-      <w:pPr>
-        <w:pStyle w:val="PargrafodaLista"/>
-        <w:ind w:firstLine="0"/>
-        <w:jc w:val="both"/>
-        <w:rPr>
-          <w:rFonts w:cs="Arial"/>
-          <w:b/>
-          <w:bCs/>
-          <w:szCs w:val="24"/>
-        </w:rPr>
-      </w:pPr>
-    </w:p>
-    <w:p>
-      <w:pPr>
-        <w:pStyle w:val="PargrafodaLista"/>
-        <w:ind w:firstLine="0"/>
-        <w:jc w:val="both"/>
-        <w:rPr>
-          <w:rFonts w:cs="Arial"/>
-          <w:b/>
-          <w:bCs/>
-          <w:szCs w:val="24"/>
-        </w:rPr>
-      </w:pPr>
-      <w:r>
-        <w:rPr>
-          <w:rFonts w:cs="Arial"/>
-          <w:b/>
-          <w:bCs/>
-          <w:szCs w:val="24"/>
-        </w:rPr>
-        <w:lastRenderedPageBreak/>
-        <w:t>4️</w:t>
-      </w:r>
-      <w:r>
-        <w:rPr>
-          <w:rFonts w:ascii="Segoe UI Symbol" w:hAnsi="Segoe UI Symbol" w:cs="Segoe UI Symbol"/>
-          <w:b/>
-          <w:bCs/>
-          <w:szCs w:val="24"/>
-        </w:rPr>
-        <w:t>⃣</w:t>
-      </w:r>
-      <w:r>
-        <w:rPr>
-          <w:rFonts w:cs="Arial"/>
-          <w:b/>
-          <w:bCs/>
-          <w:szCs w:val="24"/>
-        </w:rPr>
-        <w:t xml:space="preserve"> Política de Cancelamento</w:t>
-      </w:r>
-    </w:p>
-    <w:p>
-      <w:pPr>
-        <w:pStyle w:val="PargrafodaLista"/>
-        <w:ind w:firstLine="0"/>
-        <w:jc w:val="both"/>
-        <w:rPr>
-          <w:rFonts w:cs="Arial"/>
-          <w:b/>
-          <w:bCs/>
-          <w:szCs w:val="24"/>
-        </w:rPr>
-      </w:pPr>
-    </w:p>
-    <w:p>
-      <w:pPr>
-        <w:pStyle w:val="PargrafodaLista"/>
-        <w:ind w:firstLine="0"/>
-        <w:jc w:val="both"/>
-        <w:rPr>
-          <w:rFonts w:cs="Arial"/>
-          <w:b/>
-          <w:bCs/>
-          <w:szCs w:val="24"/>
-        </w:rPr>
-      </w:pPr>
-      <w:r>
-        <w:rPr>
-          <w:rFonts w:cs="Arial"/>
-          <w:b/>
-          <w:bCs/>
-          <w:szCs w:val="24"/>
-        </w:rPr>
-        <w:t>O cancelamento deverá ser realizado com no mínimo:</w:t>
-      </w:r>
-    </w:p>
-    <w:p>
-      <w:pPr>
-        <w:pStyle w:val="PargrafodaLista"/>
-        <w:ind w:firstLine="0"/>
-        <w:jc w:val="both"/>
-        <w:rPr>
-          <w:rFonts w:cs="Arial"/>
-          <w:b/>
-          <w:bCs/>
-          <w:szCs w:val="24"/>
-        </w:rPr>
-      </w:pPr>
-    </w:p>
-    <w:p>
-      <w:pPr>
-        <w:pStyle w:val="PargrafodaLista"/>
-        <w:ind w:firstLine="0"/>
-        <w:jc w:val="both"/>
-        <w:rPr>
-          <w:rFonts w:cs="Arial"/>
-          <w:b/>
-          <w:bCs/>
-          <w:szCs w:val="24"/>
-        </w:rPr>
-      </w:pPr>
-      <w:r>
-        <w:rPr>
-          <w:rFonts w:cs="Arial"/>
-          <w:b/>
-          <w:bCs/>
-          <w:szCs w:val="24"/>
-        </w:rPr>
-        <w:t>24 horas de antecedência</w:t>
-      </w:r>
-    </w:p>
-    <w:p>
-      <w:pPr>
-        <w:pStyle w:val="PargrafodaLista"/>
-        <w:ind w:firstLine="0"/>
-        <w:jc w:val="both"/>
-        <w:rPr>
-          <w:rFonts w:cs="Arial"/>
-          <w:b/>
-          <w:bCs/>
-          <w:szCs w:val="24"/>
-        </w:rPr>
-      </w:pPr>
-      <w:r>
-        <w:rPr>
-          <w:rFonts w:cs="Arial"/>
-          <w:b/>
-          <w:bCs/>
-          <w:szCs w:val="24"/>
-        </w:rPr>
-        <w:t>Caso contrário:</w:t>
-      </w:r>
-    </w:p>
-    <w:p>
-      <w:pPr>
-        <w:pStyle w:val="PargrafodaLista"/>
-        <w:ind w:firstLine="0"/>
-        <w:jc w:val="both"/>
-        <w:rPr>
-          <w:rFonts w:cs="Arial"/>
-          <w:b/>
-          <w:bCs/>
-          <w:szCs w:val="24"/>
-        </w:rPr>
-      </w:pPr>
-    </w:p>
-    <w:p>
-      <w:pPr>
-        <w:pStyle w:val="PargrafodaLista"/>
-        <w:ind w:firstLine="0"/>
-        <w:jc w:val="both"/>
-        <w:rPr>
-          <w:rFonts w:cs="Arial"/>
-          <w:b/>
-          <w:bCs/>
-          <w:szCs w:val="24"/>
-        </w:rPr>
-      </w:pPr>
-      <w:r>
-        <w:rPr>
-          <w:rFonts w:cs="Arial"/>
-          <w:b/>
-          <w:bCs/>
-          <w:szCs w:val="24"/>
-        </w:rPr>
-        <w:t>Poderá ser aplicada taxa de ausência</w:t>
-      </w:r>
-    </w:p>
-    <w:p>
-      <w:pPr>
-        <w:pStyle w:val="PargrafodaLista"/>
-        <w:ind w:firstLine="0"/>
-        <w:jc w:val="both"/>
-        <w:rPr>
-          <w:rFonts w:cs="Arial"/>
-          <w:b/>
-          <w:bCs/>
-          <w:szCs w:val="24"/>
-        </w:rPr>
-      </w:pPr>
-    </w:p>
-    <w:p>
-      <w:pPr>
-        <w:pStyle w:val="PargrafodaLista"/>
-        <w:ind w:firstLine="0"/>
-        <w:jc w:val="both"/>
-        <w:rPr>
-          <w:rFonts w:cs="Arial"/>
-          <w:b/>
-          <w:bCs/>
-          <w:szCs w:val="24"/>
-        </w:rPr>
-      </w:pPr>
-      <w:r>
-        <w:rPr>
-          <w:rFonts w:cs="Arial"/>
-          <w:b/>
-          <w:bCs/>
-          <w:szCs w:val="24"/>
-        </w:rPr>
-        <w:t>O paciente poderá ter restrição temporária de novos agendamentos</w:t>
-      </w:r>
-    </w:p>
-    <w:p>
-      <w:pPr>
-        <w:pStyle w:val="PargrafodaLista"/>
-        <w:ind w:firstLine="0"/>
-        <w:jc w:val="both"/>
-        <w:rPr>
-          <w:rFonts w:cs="Arial"/>
-          <w:b/>
-          <w:bCs/>
-          <w:szCs w:val="24"/>
-        </w:rPr>
-      </w:pPr>
-    </w:p>
-    <w:p>
-      <w:pPr>
-        <w:pStyle w:val="PargrafodaLista"/>
-        <w:ind w:firstLine="0"/>
-        <w:jc w:val="both"/>
-        <w:rPr>
-          <w:rFonts w:cs="Arial"/>
-          <w:b/>
-          <w:bCs/>
-          <w:szCs w:val="24"/>
-        </w:rPr>
-      </w:pPr>
-      <w:r>
-        <w:rPr>
-          <w:rFonts w:cs="Arial"/>
-          <w:b/>
-          <w:bCs/>
-          <w:szCs w:val="24"/>
-        </w:rPr>
-        <w:t>5️</w:t>
-      </w:r>
-      <w:r>
-        <w:rPr>
-          <w:rFonts w:ascii="Segoe UI Symbol" w:hAnsi="Segoe UI Symbol" w:cs="Segoe UI Symbol"/>
-          <w:b/>
-          <w:bCs/>
-          <w:szCs w:val="24"/>
-        </w:rPr>
-        <w:t>⃣</w:t>
-      </w:r>
-      <w:r>
-        <w:rPr>
-          <w:rFonts w:cs="Arial"/>
-          <w:b/>
-          <w:bCs/>
-          <w:szCs w:val="24"/>
-        </w:rPr>
-        <w:t xml:space="preserve"> Confirmação Obrigatória da Consulta</w:t>
-      </w:r>
-    </w:p>
-    <w:p>
-      <w:pPr>
-        <w:pStyle w:val="PargrafodaLista"/>
-        <w:ind w:firstLine="0"/>
-        <w:jc w:val="both"/>
-        <w:rPr>
-          <w:rFonts w:cs="Arial"/>
-          <w:b/>
-          <w:bCs/>
-          <w:szCs w:val="24"/>
-        </w:rPr>
-      </w:pPr>
-    </w:p>
-    <w:p>
-      <w:pPr>
-        <w:pStyle w:val="PargrafodaLista"/>
-        <w:ind w:firstLine="0"/>
-        <w:jc w:val="both"/>
-        <w:rPr>
-          <w:rFonts w:cs="Arial"/>
-          <w:b/>
-          <w:bCs/>
-          <w:szCs w:val="24"/>
-        </w:rPr>
-      </w:pPr>
-      <w:r>
-        <w:rPr>
-          <w:rFonts w:cs="Arial"/>
-          <w:b/>
-          <w:bCs/>
-          <w:szCs w:val="24"/>
-        </w:rPr>
-        <w:t>O paciente deverá confirmar a consulta via:</w:t>
-      </w:r>
-    </w:p>
-    <w:p>
-      <w:pPr>
-        <w:pStyle w:val="PargrafodaLista"/>
-        <w:ind w:firstLine="0"/>
-        <w:jc w:val="both"/>
-        <w:rPr>
-          <w:rFonts w:cs="Arial"/>
-          <w:b/>
-          <w:bCs/>
-          <w:szCs w:val="24"/>
-        </w:rPr>
-      </w:pPr>
-    </w:p>
-    <w:p>
-      <w:pPr>
-        <w:pStyle w:val="PargrafodaLista"/>
-        <w:ind w:firstLine="0"/>
-        <w:jc w:val="both"/>
-        <w:rPr>
-          <w:rFonts w:cs="Arial"/>
-          <w:b/>
-          <w:bCs/>
-          <w:szCs w:val="24"/>
-        </w:rPr>
-      </w:pPr>
-      <w:r>
-        <w:rPr>
-          <w:rFonts w:cs="Arial"/>
-          <w:b/>
-          <w:bCs/>
-          <w:szCs w:val="24"/>
-        </w:rPr>
-        <w:t>E-mail</w:t>
-      </w:r>
-    </w:p>
-    <w:p>
-      <w:pPr>
-        <w:pStyle w:val="PargrafodaLista"/>
-        <w:ind w:firstLine="0"/>
-        <w:jc w:val="both"/>
-        <w:rPr>
-          <w:rFonts w:cs="Arial"/>
-          <w:b/>
-          <w:bCs/>
-          <w:szCs w:val="24"/>
-        </w:rPr>
-      </w:pPr>
-    </w:p>
-    <w:p>
-      <w:pPr>
-        <w:pStyle w:val="PargrafodaLista"/>
-        <w:ind w:firstLine="0"/>
-        <w:jc w:val="both"/>
-        <w:rPr>
-          <w:rFonts w:cs="Arial"/>
-          <w:b/>
-          <w:bCs/>
-          <w:szCs w:val="24"/>
-        </w:rPr>
-      </w:pPr>
-      <w:r>
-        <w:rPr>
-          <w:rFonts w:cs="Arial"/>
-          <w:b/>
-          <w:bCs/>
-          <w:szCs w:val="24"/>
-        </w:rPr>
-        <w:t>SMS</w:t>
-      </w:r>
-    </w:p>
-    <w:p>
-      <w:pPr>
-        <w:pStyle w:val="PargrafodaLista"/>
-        <w:ind w:firstLine="0"/>
-        <w:jc w:val="both"/>
-        <w:rPr>
-          <w:rFonts w:cs="Arial"/>
-          <w:b/>
-          <w:bCs/>
-          <w:szCs w:val="24"/>
-        </w:rPr>
-      </w:pPr>
-    </w:p>
-    <w:p>
-      <w:pPr>
-        <w:pStyle w:val="PargrafodaLista"/>
-        <w:ind w:firstLine="0"/>
-        <w:jc w:val="both"/>
-        <w:rPr>
-          <w:rFonts w:cs="Arial"/>
-          <w:b/>
-          <w:bCs/>
-          <w:szCs w:val="24"/>
-        </w:rPr>
-      </w:pPr>
-      <w:r>
-        <w:rPr>
-          <w:rFonts w:cs="Arial"/>
-          <w:b/>
-          <w:bCs/>
+        <w:t xml:space="preserve">- </w:t>
+      </w:r>
+      <w:r>
+        <w:rPr>
+          <w:rFonts w:cs="Arial"/>
           <w:szCs w:val="24"/>
         </w:rPr>
         <w:t>Área logada do site</w:t>
@@ -1503,34 +1218,16 @@
     </w:p>
     <w:p>
       <w:pPr>
-        <w:pStyle w:val="PargrafodaLista"/>
-        <w:ind w:firstLine="0"/>
-        <w:jc w:val="both"/>
-        <w:rPr>
-          <w:rFonts w:cs="Arial"/>
-          <w:b/>
-          <w:bCs/>
-          <w:szCs w:val="24"/>
-        </w:rPr>
-      </w:pPr>
-    </w:p>
-    <w:p>
-      <w:pPr>
-        <w:pStyle w:val="PargrafodaLista"/>
-        <w:ind w:firstLine="0"/>
-        <w:jc w:val="both"/>
-        <w:rPr>
-          <w:rFonts w:cs="Arial"/>
-          <w:b/>
-          <w:bCs/>
-          <w:szCs w:val="24"/>
-        </w:rPr>
-      </w:pPr>
-      <w:r>
-        <w:rPr>
-          <w:rFonts w:cs="Arial"/>
-          <w:b/>
-          <w:bCs/>
+        <w:ind w:firstLine="0"/>
+        <w:jc w:val="both"/>
+        <w:rPr>
+          <w:rFonts w:cs="Arial"/>
+          <w:szCs w:val="24"/>
+        </w:rPr>
+      </w:pPr>
+      <w:r>
+        <w:rPr>
+          <w:rFonts w:cs="Arial"/>
           <w:szCs w:val="24"/>
         </w:rPr>
         <w:t>Caso não confirme até 12 horas antes, o sistema poderá:</w:t>
@@ -1538,34 +1235,23 @@
     </w:p>
     <w:p>
       <w:pPr>
-        <w:pStyle w:val="PargrafodaLista"/>
-        <w:ind w:firstLine="0"/>
-        <w:jc w:val="both"/>
-        <w:rPr>
-          <w:rFonts w:cs="Arial"/>
-          <w:b/>
-          <w:bCs/>
-          <w:szCs w:val="24"/>
-        </w:rPr>
-      </w:pPr>
-    </w:p>
-    <w:p>
-      <w:pPr>
-        <w:pStyle w:val="PargrafodaLista"/>
-        <w:ind w:firstLine="0"/>
-        <w:jc w:val="both"/>
-        <w:rPr>
-          <w:rFonts w:cs="Arial"/>
-          <w:b/>
-          <w:bCs/>
-          <w:szCs w:val="24"/>
-        </w:rPr>
-      </w:pPr>
-      <w:r>
-        <w:rPr>
-          <w:rFonts w:cs="Arial"/>
-          <w:b/>
-          <w:bCs/>
+        <w:ind w:firstLine="0"/>
+        <w:jc w:val="both"/>
+        <w:rPr>
+          <w:rFonts w:cs="Arial"/>
+          <w:szCs w:val="24"/>
+        </w:rPr>
+      </w:pPr>
+      <w:r>
+        <w:rPr>
+          <w:rFonts w:cs="Arial"/>
+          <w:szCs w:val="24"/>
+        </w:rPr>
+        <w:t xml:space="preserve">- </w:t>
+      </w:r>
+      <w:r>
+        <w:rPr>
+          <w:rFonts w:cs="Arial"/>
           <w:szCs w:val="24"/>
         </w:rPr>
         <w:t>Cancelar automaticamente</w:t>
@@ -1573,34 +1259,23 @@
     </w:p>
     <w:p>
       <w:pPr>
-        <w:pStyle w:val="PargrafodaLista"/>
-        <w:ind w:firstLine="0"/>
-        <w:jc w:val="both"/>
-        <w:rPr>
-          <w:rFonts w:cs="Arial"/>
-          <w:b/>
-          <w:bCs/>
-          <w:szCs w:val="24"/>
-        </w:rPr>
-      </w:pPr>
-    </w:p>
-    <w:p>
-      <w:pPr>
-        <w:pStyle w:val="PargrafodaLista"/>
-        <w:ind w:firstLine="0"/>
-        <w:jc w:val="both"/>
-        <w:rPr>
-          <w:rFonts w:cs="Arial"/>
-          <w:b/>
-          <w:bCs/>
-          <w:szCs w:val="24"/>
-        </w:rPr>
-      </w:pPr>
-      <w:r>
-        <w:rPr>
-          <w:rFonts w:cs="Arial"/>
-          <w:b/>
-          <w:bCs/>
+        <w:ind w:firstLine="0"/>
+        <w:jc w:val="both"/>
+        <w:rPr>
+          <w:rFonts w:cs="Arial"/>
+          <w:szCs w:val="24"/>
+        </w:rPr>
+      </w:pPr>
+      <w:r>
+        <w:rPr>
+          <w:rFonts w:cs="Arial"/>
+          <w:szCs w:val="24"/>
+        </w:rPr>
+        <w:t xml:space="preserve">- </w:t>
+      </w:r>
+      <w:r>
+        <w:rPr>
+          <w:rFonts w:cs="Arial"/>
           <w:szCs w:val="24"/>
         </w:rPr>
         <w:t>Liberar o horário para outro paciente</w:t>
@@ -1617,172 +1292,24 @@
           <w:szCs w:val="24"/>
         </w:rPr>
       </w:pPr>
-      <w:r>
-        <w:rPr>
-          <w:rFonts w:cs="Arial"/>
-          <w:b/>
-          <w:bCs/>
-          <w:szCs w:val="24"/>
-        </w:rPr>
-        <w:t>RN001 – Acesso à sessão de Cadastro</w:t>
-      </w:r>
-    </w:p>
-    <w:p>
-      <w:pPr>
-        <w:ind w:firstLine="0"/>
-        <w:jc w:val="both"/>
-        <w:rPr>
-          <w:rFonts w:cs="Arial"/>
-          <w:szCs w:val="24"/>
-        </w:rPr>
-      </w:pPr>
-      <w:r>
-        <w:rPr>
-          <w:rFonts w:cs="Arial"/>
-          <w:b/>
-          <w:bCs/>
-          <w:szCs w:val="24"/>
-        </w:rPr>
-        <w:t>Descrição:</w:t>
-      </w:r>
-      <w:r>
-        <w:rPr>
-          <w:rFonts w:cs="Arial"/>
-          <w:szCs w:val="24"/>
-        </w:rPr>
-        <w:t xml:space="preserve"> A pessoa que entrar no site entrará em um modo de demonstração, podendo visualizar o site, mas não fazer consultas, o local de cadastrar como paciente é diferente do de médico para evitar o cadastro de médicos falsos.</w:t>
-      </w:r>
-    </w:p>
-    <w:p>
-      <w:pPr>
-        <w:ind w:firstLine="0"/>
-        <w:jc w:val="both"/>
-        <w:rPr>
-          <w:rFonts w:cs="Arial"/>
-          <w:szCs w:val="24"/>
-        </w:rPr>
-      </w:pPr>
-      <w:r>
-        <w:rPr>
-          <w:rFonts w:cs="Arial"/>
-          <w:b/>
-          <w:bCs/>
-          <w:szCs w:val="24"/>
-        </w:rPr>
-        <w:t>Condição:</w:t>
-      </w:r>
-      <w:r>
-        <w:rPr>
-          <w:rFonts w:cs="Arial"/>
-          <w:szCs w:val="24"/>
-        </w:rPr>
-        <w:t xml:space="preserve"> ao clicar na opção de ‘Cadastra</w:t>
-      </w:r>
-      <w:r>
-        <w:rPr>
-          <w:rFonts w:cs="Arial"/>
-          <w:szCs w:val="24"/>
-        </w:rPr>
-        <w:t>r’ no canto da tela, o site irá te enviar para</w:t>
-      </w:r>
-    </w:p>
-    <w:p>
-      <w:pPr>
-        <w:ind w:firstLine="0"/>
-        <w:jc w:val="both"/>
-        <w:rPr>
-          <w:rFonts w:cs="Arial"/>
-          <w:szCs w:val="24"/>
-        </w:rPr>
-      </w:pPr>
-    </w:p>
-    <w:p>
-      <w:pPr>
-        <w:ind w:firstLine="0"/>
-        <w:jc w:val="both"/>
-        <w:rPr>
-          <w:rFonts w:cs="Arial"/>
-          <w:szCs w:val="24"/>
-        </w:rPr>
-      </w:pPr>
-    </w:p>
-    <w:p>
-      <w:pPr>
-        <w:ind w:firstLine="0"/>
-        <w:jc w:val="both"/>
-        <w:rPr>
-          <w:rFonts w:cs="Arial"/>
-          <w:szCs w:val="24"/>
-        </w:rPr>
-      </w:pPr>
-    </w:p>
-    <w:p>
-      <w:pPr>
-        <w:ind w:firstLine="0"/>
-        <w:jc w:val="both"/>
-        <w:rPr>
-          <w:rFonts w:cs="Arial"/>
-          <w:szCs w:val="24"/>
-        </w:rPr>
-      </w:pPr>
-      <w:r>
-        <w:rPr>
-          <w:rFonts w:cs="Arial"/>
-          <w:szCs w:val="24"/>
-        </w:rPr>
-        <w:t xml:space="preserve"> o site irá verificar o e-mail logado no google se ele é profissional ou não e deve impedir os que não forem. </w:t>
-      </w:r>
-    </w:p>
-    <w:p>
-      <w:pPr>
-        <w:ind w:firstLine="0"/>
-        <w:jc w:val="both"/>
-        <w:rPr>
-          <w:rFonts w:cs="Arial"/>
-          <w:szCs w:val="24"/>
-        </w:rPr>
-      </w:pPr>
-      <w:r>
-        <w:rPr>
-          <w:rFonts w:cs="Arial"/>
-          <w:b/>
-          <w:bCs/>
-          <w:szCs w:val="24"/>
-        </w:rPr>
-        <w:t>Ação do sistema</w:t>
-      </w:r>
-      <w:r>
-        <w:rPr>
-          <w:rFonts w:cs="Arial"/>
-          <w:szCs w:val="24"/>
-        </w:rPr>
-        <w:t xml:space="preserve">: O sistema deve impedir o acesso à página (erro 403) e registrar a tentativa de acesso indevido. </w:t>
-      </w:r>
-    </w:p>
-    <w:p>
-      <w:pPr>
-        <w:ind w:firstLine="0"/>
-        <w:jc w:val="both"/>
-        <w:rPr>
-          <w:rFonts w:cs="Arial"/>
-          <w:szCs w:val="24"/>
-        </w:rPr>
-      </w:pPr>
-      <w:r>
-        <w:rPr>
-          <w:rFonts w:cs="Arial"/>
-          <w:b/>
-          <w:bCs/>
-          <w:szCs w:val="24"/>
-        </w:rPr>
-        <w:t>Mensagem ao usuário:</w:t>
-      </w:r>
-      <w:r>
-        <w:rPr>
-          <w:rFonts w:cs="Arial"/>
-          <w:szCs w:val="24"/>
-        </w:rPr>
-        <w:t xml:space="preserve"> “Acesso negado. Você não poderá entrar nessa sessão de cadastro sem um e-mail profissional de médico.” </w:t>
+    </w:p>
+    <w:p>
+      <w:pPr>
+        <w:ind w:firstLine="0"/>
+        <w:jc w:val="both"/>
+        <w:rPr>
+          <w:rFonts w:cs="Arial"/>
+          <w:szCs w:val="24"/>
+        </w:rPr>
+      </w:pPr>
+      <w:r>
+        <w:rPr>
+          <w:rFonts w:cs="Arial"/>
+          <w:b/>
+          <w:bCs/>
+          <w:szCs w:val="24"/>
+        </w:rPr>
+        <w:t xml:space="preserve">RN001 – </w:t>
       </w:r>
     </w:p>
     <w:p>
@@ -1859,284 +1386,17 @@
         <w:jc w:val="both"/>
         <w:rPr>
           <w:rFonts w:cs="Arial"/>
-          <w:b/>
-          <w:bCs/>
-          <w:szCs w:val="24"/>
-        </w:rPr>
-      </w:pPr>
-      <w:r>
-        <w:rPr>
-          <w:rFonts w:cs="Arial"/>
-          <w:b/>
-          <w:bCs/>
-          <w:szCs w:val="24"/>
-        </w:rPr>
-        <w:t xml:space="preserve">RN004 – Acesso a Prontuários Médicos </w:t>
-      </w:r>
-    </w:p>
-    <w:p>
-      <w:pPr>
-        <w:ind w:firstLine="0"/>
-        <w:jc w:val="both"/>
-        <w:rPr>
-          <w:rFonts w:cs="Arial"/>
-          <w:szCs w:val="24"/>
-        </w:rPr>
-      </w:pPr>
-    </w:p>
-    <w:p>
-      <w:pPr>
-        <w:ind w:firstLine="0"/>
-        <w:jc w:val="both"/>
-        <w:rPr>
-          <w:rFonts w:cs="Arial"/>
-          <w:szCs w:val="24"/>
-        </w:rPr>
-      </w:pPr>
-      <w:r>
-        <w:rPr>
-          <w:rFonts w:cs="Arial"/>
-          <w:b/>
-          <w:bCs/>
-          <w:szCs w:val="24"/>
-        </w:rPr>
-        <w:t>Descrição:</w:t>
-      </w:r>
-      <w:r>
-        <w:rPr>
-          <w:rFonts w:cs="Arial"/>
-          <w:szCs w:val="24"/>
-        </w:rPr>
-        <w:t xml:space="preserve"> Apenas o médico responsável pelo atendimento ou administradores de saúde autorizados podem visualizar e editar o prontuário de um paciente. </w:t>
-      </w:r>
-    </w:p>
-    <w:p>
-      <w:pPr>
-        <w:ind w:firstLine="0"/>
-        <w:jc w:val="both"/>
-        <w:rPr>
-          <w:rFonts w:cs="Arial"/>
-          <w:szCs w:val="24"/>
-        </w:rPr>
-      </w:pPr>
-      <w:r>
-        <w:rPr>
-          <w:rFonts w:cs="Arial"/>
-          <w:b/>
-          <w:bCs/>
-          <w:szCs w:val="24"/>
-        </w:rPr>
-        <w:t>Condição:</w:t>
-      </w:r>
-      <w:r>
-        <w:rPr>
-          <w:rFonts w:cs="Arial"/>
-          <w:szCs w:val="24"/>
-        </w:rPr>
-        <w:t xml:space="preserve"> Quando um usuário logado tenta acessar a rota de "Prontuário" de um paciente específico. </w:t>
-      </w:r>
-    </w:p>
-    <w:p>
-      <w:pPr>
-        <w:ind w:firstLine="0"/>
-        <w:jc w:val="both"/>
-        <w:rPr>
-          <w:rFonts w:cs="Arial"/>
-          <w:szCs w:val="24"/>
-        </w:rPr>
-      </w:pPr>
-      <w:r>
-        <w:rPr>
-          <w:rFonts w:cs="Arial"/>
-          <w:b/>
-          <w:bCs/>
-          <w:szCs w:val="24"/>
-        </w:rPr>
-        <w:t>Ação do sistema:</w:t>
-      </w:r>
-      <w:r>
-        <w:rPr>
-          <w:rFonts w:cs="Arial"/>
-          <w:szCs w:val="24"/>
-        </w:rPr>
-        <w:t xml:space="preserve"> O sistema deve impedir o acesso à página (erro 403) e registrar a tentativa de acesso indevido. </w:t>
-      </w:r>
-    </w:p>
-    <w:p>
-      <w:pPr>
-        <w:ind w:firstLine="0"/>
-        <w:jc w:val="both"/>
-        <w:rPr>
-          <w:rFonts w:cs="Arial"/>
-          <w:szCs w:val="24"/>
-        </w:rPr>
-      </w:pPr>
-      <w:r>
-        <w:rPr>
-          <w:rFonts w:cs="Arial"/>
-          <w:b/>
-          <w:bCs/>
-          <w:szCs w:val="24"/>
-        </w:rPr>
-        <w:t>Mensagem ao usuário:</w:t>
-      </w:r>
-      <w:r>
-        <w:rPr>
-          <w:rFonts w:cs="Arial"/>
-          <w:szCs w:val="24"/>
-        </w:rPr>
-        <w:t xml:space="preserve"> “Acesso negado. Você não tem permissão para visualizar este prontuário.” </w:t>
-      </w:r>
-    </w:p>
-    <w:p>
-      <w:pPr>
-        <w:ind w:firstLine="0"/>
-        <w:jc w:val="both"/>
-        <w:rPr>
-          <w:rFonts w:cs="Arial"/>
-          <w:szCs w:val="24"/>
-        </w:rPr>
-      </w:pPr>
-    </w:p>
-    <w:p>
-      <w:pPr>
-        <w:ind w:firstLine="0"/>
-        <w:jc w:val="both"/>
-        <w:rPr>
-          <w:rFonts w:cs="Arial"/>
-          <w:b/>
-          <w:bCs/>
-          <w:szCs w:val="24"/>
-        </w:rPr>
-      </w:pPr>
-      <w:r>
-        <w:rPr>
-          <w:rFonts w:cs="Arial"/>
-          <w:b/>
-          <w:bCs/>
-          <w:szCs w:val="24"/>
-        </w:rPr>
-        <w:t xml:space="preserve">RN005 – Disponibilidade de Agendamento </w:t>
-      </w:r>
-    </w:p>
-    <w:p>
-      <w:pPr>
-        <w:ind w:firstLine="0"/>
-        <w:jc w:val="both"/>
-        <w:rPr>
-          <w:rFonts w:cs="Arial"/>
-          <w:szCs w:val="24"/>
-        </w:rPr>
-      </w:pPr>
-      <w:r>
-        <w:rPr>
-          <w:rFonts w:cs="Arial"/>
-          <w:b/>
-          <w:bCs/>
-          <w:szCs w:val="24"/>
-        </w:rPr>
-        <w:t>Descrição:</w:t>
-      </w:r>
-      <w:r>
-        <w:rPr>
-          <w:rFonts w:cs="Arial"/>
-          <w:szCs w:val="24"/>
-        </w:rPr>
-        <w:t xml:space="preserve"> Um médico não pode ter duas consultas agendadas para o mesmo horário. </w:t>
-      </w:r>
-    </w:p>
-    <w:p>
-      <w:pPr>
-        <w:ind w:firstLine="0"/>
-        <w:jc w:val="both"/>
-        <w:rPr>
-          <w:rFonts w:cs="Arial"/>
-          <w:szCs w:val="24"/>
-        </w:rPr>
-      </w:pPr>
-      <w:r>
-        <w:rPr>
-          <w:rFonts w:cs="Arial"/>
-          <w:b/>
-          <w:bCs/>
-          <w:szCs w:val="24"/>
-        </w:rPr>
-        <w:t>Condição:</w:t>
-      </w:r>
-      <w:r>
-        <w:rPr>
-          <w:rFonts w:cs="Arial"/>
-          <w:szCs w:val="24"/>
-        </w:rPr>
-        <w:t xml:space="preserve"> Quando o paciente ou a recepção tenta confirmar um agendamento após selecionar data e hora. </w:t>
-      </w:r>
-    </w:p>
-    <w:p>
-      <w:pPr>
-        <w:ind w:firstLine="0"/>
-        <w:jc w:val="both"/>
-        <w:rPr>
-          <w:rFonts w:cs="Arial"/>
-          <w:szCs w:val="24"/>
-        </w:rPr>
-      </w:pPr>
-      <w:r>
-        <w:rPr>
-          <w:rFonts w:cs="Arial"/>
-          <w:b/>
-          <w:bCs/>
-          <w:szCs w:val="24"/>
-        </w:rPr>
-        <w:t>Ação do sistema</w:t>
-      </w:r>
-      <w:r>
-        <w:rPr>
-          <w:rFonts w:cs="Arial"/>
-          <w:b/>
-          <w:bCs/>
-          <w:szCs w:val="24"/>
-        </w:rPr>
-        <w:t>:</w:t>
-      </w:r>
-      <w:r>
-        <w:rPr>
-          <w:rFonts w:cs="Arial"/>
-          <w:szCs w:val="24"/>
-        </w:rPr>
-        <w:t xml:space="preserve"> </w:t>
-      </w:r>
-      <w:r>
-        <w:rPr>
-          <w:rFonts w:cs="Arial"/>
-          <w:szCs w:val="24"/>
-        </w:rPr>
-        <w:t xml:space="preserve">O sistema deve bloquear a gravação do agendamento. </w:t>
-      </w:r>
-    </w:p>
-    <w:p>
-      <w:pPr>
-        <w:ind w:firstLine="0"/>
-        <w:jc w:val="both"/>
-        <w:rPr>
-          <w:rFonts w:cs="Arial"/>
-          <w:szCs w:val="24"/>
-        </w:rPr>
-      </w:pPr>
-      <w:r>
-        <w:rPr>
-          <w:rFonts w:cs="Arial"/>
-          <w:b/>
-          <w:bCs/>
-          <w:szCs w:val="24"/>
-        </w:rPr>
-        <w:t>Mensagem ao usuário:</w:t>
-      </w:r>
-      <w:r>
-        <w:rPr>
-          <w:rFonts w:cs="Arial"/>
-          <w:szCs w:val="24"/>
-        </w:rPr>
-        <w:t xml:space="preserve"> “Este horário já não está mais disponível. Por favor, escolha outro horário ou médico.” </w:t>
+          <w:szCs w:val="24"/>
+        </w:rPr>
+      </w:pPr>
+      <w:r>
+        <w:rPr>
+          <w:rFonts w:cs="Arial"/>
+          <w:b/>
+          <w:bCs/>
+          <w:szCs w:val="24"/>
+        </w:rPr>
+        <w:t xml:space="preserve">RN004 – </w:t>
       </w:r>
     </w:p>
     <w:p>
@@ -2205,7 +1465,6 @@
           <w:bCs/>
           <w:szCs w:val="24"/>
         </w:rPr>
-        <w:lastRenderedPageBreak/>
         <w:t xml:space="preserve">RF001 – Cadastrar Paciente </w:t>
       </w:r>
     </w:p>
@@ -2612,6 +1871,7 @@
           <w:bCs/>
           <w:szCs w:val="24"/>
         </w:rPr>
+        <w:lastRenderedPageBreak/>
         <w:t xml:space="preserve">Saídas:  </w:t>
       </w:r>
     </w:p>
@@ -2966,7 +2226,6 @@
           <w:bCs/>
           <w:szCs w:val="24"/>
         </w:rPr>
-        <w:lastRenderedPageBreak/>
         <w:t>Entradas:</w:t>
       </w:r>
     </w:p>
@@ -3339,6 +2598,7 @@
           <w:rFonts w:cs="Arial"/>
           <w:szCs w:val="24"/>
         </w:rPr>
+        <w:lastRenderedPageBreak/>
         <w:t>E-mail ou CRM já estiverem vinculados a outra conta no sistema.</w:t>
       </w:r>
     </w:p>
@@ -3669,7 +2929,6 @@
           <w:bCs/>
           <w:szCs w:val="24"/>
         </w:rPr>
-        <w:lastRenderedPageBreak/>
         <w:t>Data</w:t>
       </w:r>
       <w:r>
@@ -4146,6 +3405,7 @@
           <w:bCs/>
           <w:szCs w:val="24"/>
         </w:rPr>
+        <w:lastRenderedPageBreak/>
         <w:t>E-mail</w:t>
       </w:r>
       <w:r>
@@ -4355,16 +3615,7 @@
           <w:bCs/>
           <w:szCs w:val="24"/>
         </w:rPr>
-        <w:t xml:space="preserve">RF004 </w:t>
-      </w:r>
-      <w:r>
-        <w:rPr>
-          <w:rFonts w:cs="Arial"/>
-          <w:b/>
-          <w:bCs/>
-          <w:szCs w:val="24"/>
-        </w:rPr>
-        <w:t>–</w:t>
+        <w:t>RF004 –</w:t>
       </w:r>
       <w:r>
         <w:rPr>
@@ -4451,7 +3702,6 @@
           <w:bCs/>
           <w:szCs w:val="24"/>
         </w:rPr>
-        <w:lastRenderedPageBreak/>
         <w:t>Ação do sistema:</w:t>
       </w:r>
       <w:r>
@@ -4800,6 +4050,7 @@
           <w:rFonts w:cs="Arial"/>
           <w:szCs w:val="24"/>
         </w:rPr>
+        <w:lastRenderedPageBreak/>
         <w:t xml:space="preserve">Saídas: </w:t>
       </w:r>
     </w:p>
@@ -5058,7 +4309,6 @@
           <w:bCs/>
           <w:szCs w:val="24"/>
         </w:rPr>
-        <w:lastRenderedPageBreak/>
         <w:t xml:space="preserve">Processamento: </w:t>
       </w:r>
     </w:p>
@@ -5452,6 +4702,7 @@
           <w:bCs/>
           <w:szCs w:val="24"/>
         </w:rPr>
+        <w:lastRenderedPageBreak/>
         <w:t xml:space="preserve">Saídas: </w:t>
       </w:r>
     </w:p>
@@ -5568,25 +4819,7 @@
           <w:bCs/>
           <w:szCs w:val="24"/>
         </w:rPr>
-        <w:t>RF00</w:t>
-      </w:r>
-      <w:r>
-        <w:rPr>
-          <w:rFonts w:cs="Arial"/>
-          <w:b/>
-          <w:bCs/>
-          <w:szCs w:val="24"/>
-        </w:rPr>
-        <w:t>4</w:t>
-      </w:r>
-      <w:r>
-        <w:rPr>
-          <w:rFonts w:cs="Arial"/>
-          <w:b/>
-          <w:bCs/>
-          <w:szCs w:val="24"/>
-        </w:rPr>
-        <w:t xml:space="preserve"> – Emitir Documentos Digitais (Atestados/Receitas) </w:t>
+        <w:t xml:space="preserve">RF004 – Emitir Documentos Digitais (Atestados/Receitas) </w:t>
       </w:r>
     </w:p>
     <w:p>
@@ -5768,7 +5001,6 @@
           <w:bCs/>
           <w:szCs w:val="24"/>
         </w:rPr>
-        <w:lastRenderedPageBreak/>
         <w:t>Data da consulta</w:t>
       </w:r>
       <w:r>
@@ -9320,7 +8552,6 @@
   <w:style w:type="character" w:default="1" w:styleId="Fontepargpadro">
     <w:name w:val="Default Paragraph Font"/>
     <w:uiPriority w:val="1"/>
-    <w:semiHidden/>
     <w:unhideWhenUsed/>
   </w:style>
   <w:style w:type="table" w:default="1" w:styleId="Tabelanormal">

</xml_diff>

<commit_message>
test: enviando as mudanças do Pull para a minha branch
</commit_message>
<xml_diff>
--- a/docs/Sprint 05- Regra-de-negogio-e-Requisitos-do-Sistema.docx
+++ b/docs/Sprint 05- Regra-de-negogio-e-Requisitos-do-Sistema.docx
@@ -47,7 +47,11 @@
         </w:rPr>
         <w:t>TÉCNICO DESENVOLVIMENTO DE SISTEMAS</w:t>
       </w:r>
-      <w:r>
+    </w:p>
+    <w:p>
+      <w:pPr>
+        <w:ind w:leftChars="300" w:left="720" w:right="1134"/>
+        <w:jc w:val="center"/>
         <w:rPr>
           <w:rFonts w:cs="Arial"/>
           <w:b/>
@@ -55,8 +59,7 @@
           <w:sz w:val="28"/>
           <w:szCs w:val="28"/>
         </w:rPr>
-        <w:br/>
-      </w:r>
+      </w:pPr>
       <w:r>
         <w:rPr>
           <w:rFonts w:cs="Arial"/>
@@ -283,16 +286,17 @@
         </w:rPr>
         <w:t>5</w:t>
       </w:r>
-      <w:r>
-        <w:rPr>
-          <w:rFonts w:cs="Arial"/>
-          <w:b/>
-          <w:bCs/>
+    </w:p>
+    <w:p>
+      <w:pPr>
+        <w:ind w:leftChars="300" w:left="720" w:right="1134"/>
+        <w:jc w:val="center"/>
+        <w:rPr>
+          <w:rFonts w:cs="Arial"/>
           <w:sz w:val="28"/>
           <w:szCs w:val="28"/>
         </w:rPr>
-        <w:br/>
-      </w:r>
+      </w:pPr>
       <w:r>
         <w:rPr>
           <w:rFonts w:cs="Arial"/>
@@ -301,29 +305,42 @@
         </w:rPr>
         <w:t>Regra de negócio </w:t>
       </w:r>
-      <w:r>
+    </w:p>
+    <w:p>
+      <w:pPr>
+        <w:ind w:leftChars="300" w:left="720" w:right="1134"/>
+        <w:jc w:val="center"/>
         <w:rPr>
           <w:rFonts w:cs="Arial"/>
           <w:sz w:val="28"/>
           <w:szCs w:val="28"/>
         </w:rPr>
-        <w:br/>
-        <w:t>&amp;</w:t>
-      </w:r>
+      </w:pPr>
       <w:r>
         <w:rPr>
           <w:rFonts w:cs="Arial"/>
           <w:sz w:val="28"/>
           <w:szCs w:val="28"/>
         </w:rPr>
-        <w:br/>
-      </w:r>
-      <w:r>
+        <w:t>&amp;</w:t>
+      </w:r>
+    </w:p>
+    <w:p>
+      <w:pPr>
+        <w:ind w:leftChars="300" w:left="720" w:right="1134"/>
+        <w:jc w:val="center"/>
         <w:rPr>
           <w:rFonts w:cs="Arial"/>
           <w:sz w:val="28"/>
           <w:szCs w:val="28"/>
         </w:rPr>
+      </w:pPr>
+      <w:r>
+        <w:rPr>
+          <w:rFonts w:cs="Arial"/>
+          <w:sz w:val="28"/>
+          <w:szCs w:val="28"/>
+        </w:rPr>
         <w:t>Requisitos do Sistema</w:t>
       </w:r>
     </w:p>
@@ -333,8 +350,6 @@
         <w:jc w:val="center"/>
         <w:rPr>
           <w:rFonts w:cs="Arial"/>
-          <w:b/>
-          <w:bCs/>
           <w:sz w:val="28"/>
           <w:szCs w:val="28"/>
         </w:rPr>
@@ -346,8 +361,6 @@
         <w:jc w:val="center"/>
         <w:rPr>
           <w:rFonts w:cs="Arial"/>
-          <w:b/>
-          <w:bCs/>
           <w:sz w:val="28"/>
           <w:szCs w:val="28"/>
         </w:rPr>
@@ -359,8 +372,6 @@
         <w:jc w:val="center"/>
         <w:rPr>
           <w:rFonts w:cs="Arial"/>
-          <w:b/>
-          <w:bCs/>
           <w:sz w:val="28"/>
           <w:szCs w:val="28"/>
         </w:rPr>
@@ -372,8 +383,6 @@
         <w:jc w:val="center"/>
         <w:rPr>
           <w:rFonts w:cs="Arial"/>
-          <w:b/>
-          <w:bCs/>
           <w:sz w:val="28"/>
           <w:szCs w:val="28"/>
         </w:rPr>
@@ -385,8 +394,6 @@
         <w:jc w:val="center"/>
         <w:rPr>
           <w:rFonts w:cs="Arial"/>
-          <w:b/>
-          <w:bCs/>
           <w:sz w:val="28"/>
           <w:szCs w:val="28"/>
         </w:rPr>
@@ -398,8 +405,6 @@
         <w:jc w:val="center"/>
         <w:rPr>
           <w:rFonts w:cs="Arial"/>
-          <w:b/>
-          <w:bCs/>
           <w:sz w:val="28"/>
           <w:szCs w:val="28"/>
         </w:rPr>
@@ -411,8 +416,6 @@
         <w:jc w:val="center"/>
         <w:rPr>
           <w:rFonts w:cs="Arial"/>
-          <w:b/>
-          <w:bCs/>
           <w:sz w:val="28"/>
           <w:szCs w:val="28"/>
         </w:rPr>
@@ -424,8 +427,6 @@
         <w:jc w:val="center"/>
         <w:rPr>
           <w:rFonts w:cs="Arial"/>
-          <w:b/>
-          <w:bCs/>
           <w:sz w:val="28"/>
           <w:szCs w:val="28"/>
         </w:rPr>
@@ -449,6 +450,7 @@
         <w:ind w:leftChars="300" w:left="720" w:right="1134"/>
         <w:jc w:val="center"/>
         <w:rPr>
+          <w:rFonts w:cs="Arial"/>
           <w:b/>
           <w:bCs/>
           <w:sz w:val="28"/>
@@ -465,7 +467,11 @@
         </w:rPr>
         <w:t>Sertãozinho</w:t>
       </w:r>
-      <w:r>
+    </w:p>
+    <w:p>
+      <w:pPr>
+        <w:ind w:leftChars="300" w:left="720" w:right="1134"/>
+        <w:jc w:val="center"/>
         <w:rPr>
           <w:rFonts w:cs="Arial"/>
           <w:b/>
@@ -473,8 +479,7 @@
           <w:sz w:val="28"/>
           <w:szCs w:val="28"/>
         </w:rPr>
-        <w:br/>
-      </w:r>
+      </w:pPr>
       <w:r>
         <w:rPr>
           <w:b/>
@@ -499,10 +504,10 @@
         <w:ind w:leftChars="300" w:left="720" w:right="1134"/>
         <w:jc w:val="center"/>
         <w:rPr>
-          <w:b/>
-          <w:bCs/>
-          <w:sz w:val="28"/>
-          <w:szCs w:val="28"/>
+          <w:rFonts w:cs="Arial"/>
+          <w:b/>
+          <w:bCs/>
+          <w:szCs w:val="24"/>
         </w:rPr>
       </w:pPr>
     </w:p>
@@ -1205,7 +1210,48 @@
           <w:rFonts w:cs="Arial"/>
           <w:szCs w:val="24"/>
         </w:rPr>
+        <w:t xml:space="preserve">- </w:t>
+      </w:r>
+      <w:r>
+        <w:rPr>
+          <w:rFonts w:cs="Arial"/>
+          <w:szCs w:val="24"/>
+        </w:rPr>
+        <w:t>Área logada do site</w:t>
+      </w:r>
+    </w:p>
+    <w:p>
+      <w:pPr>
+        <w:ind w:firstLine="0"/>
+        <w:jc w:val="both"/>
+        <w:rPr>
+          <w:rFonts w:cs="Arial"/>
+          <w:szCs w:val="24"/>
+        </w:rPr>
+      </w:pPr>
+      <w:r>
+        <w:rPr>
+          <w:rFonts w:cs="Arial"/>
+          <w:szCs w:val="24"/>
+        </w:rPr>
         <w:lastRenderedPageBreak/>
+        <w:t>Caso não confirme até 12 horas antes, o sistema poderá:</w:t>
+      </w:r>
+    </w:p>
+    <w:p>
+      <w:pPr>
+        <w:ind w:firstLine="0"/>
+        <w:jc w:val="both"/>
+        <w:rPr>
+          <w:rFonts w:cs="Arial"/>
+          <w:szCs w:val="24"/>
+        </w:rPr>
+      </w:pPr>
+      <w:r>
+        <w:rPr>
+          <w:rFonts w:cs="Arial"/>
+          <w:szCs w:val="24"/>
+        </w:rPr>
         <w:t xml:space="preserve">- </w:t>
       </w:r>
       <w:r>
@@ -1213,24 +1259,7 @@
           <w:rFonts w:cs="Arial"/>
           <w:szCs w:val="24"/>
         </w:rPr>
-        <w:t>Área logada do site</w:t>
-      </w:r>
-    </w:p>
-    <w:p>
-      <w:pPr>
-        <w:ind w:firstLine="0"/>
-        <w:jc w:val="both"/>
-        <w:rPr>
-          <w:rFonts w:cs="Arial"/>
-          <w:szCs w:val="24"/>
-        </w:rPr>
-      </w:pPr>
-      <w:r>
-        <w:rPr>
-          <w:rFonts w:cs="Arial"/>
-          <w:szCs w:val="24"/>
-        </w:rPr>
-        <w:t>Caso não confirme até 12 horas antes, o sistema poderá:</w:t>
+        <w:t>Cancelar automaticamente</w:t>
       </w:r>
     </w:p>
     <w:p>
@@ -1254,149 +1283,7 @@
           <w:rFonts w:cs="Arial"/>
           <w:szCs w:val="24"/>
         </w:rPr>
-        <w:t>Cancelar automaticamente</w:t>
-      </w:r>
-    </w:p>
-    <w:p>
-      <w:pPr>
-        <w:ind w:firstLine="0"/>
-        <w:jc w:val="both"/>
-        <w:rPr>
-          <w:rFonts w:cs="Arial"/>
-          <w:szCs w:val="24"/>
-        </w:rPr>
-      </w:pPr>
-      <w:r>
-        <w:rPr>
-          <w:rFonts w:cs="Arial"/>
-          <w:szCs w:val="24"/>
-        </w:rPr>
-        <w:t xml:space="preserve">- </w:t>
-      </w:r>
-      <w:r>
-        <w:rPr>
-          <w:rFonts w:cs="Arial"/>
-          <w:szCs w:val="24"/>
-        </w:rPr>
         <w:t>Liberar o horário para outro paciente</w:t>
-      </w:r>
-    </w:p>
-    <w:p>
-      <w:pPr>
-        <w:ind w:firstLine="0"/>
-        <w:jc w:val="both"/>
-        <w:rPr>
-          <w:rFonts w:cs="Arial"/>
-          <w:b/>
-          <w:bCs/>
-          <w:szCs w:val="24"/>
-        </w:rPr>
-      </w:pPr>
-    </w:p>
-    <w:p>
-      <w:pPr>
-        <w:ind w:firstLine="0"/>
-        <w:jc w:val="both"/>
-        <w:rPr>
-          <w:rFonts w:cs="Arial"/>
-          <w:szCs w:val="24"/>
-        </w:rPr>
-      </w:pPr>
-      <w:r>
-        <w:rPr>
-          <w:rFonts w:cs="Arial"/>
-          <w:b/>
-          <w:bCs/>
-          <w:szCs w:val="24"/>
-        </w:rPr>
-        <w:t xml:space="preserve">RN001 – </w:t>
-      </w:r>
-    </w:p>
-    <w:p>
-      <w:pPr>
-        <w:ind w:firstLine="0"/>
-        <w:jc w:val="both"/>
-        <w:rPr>
-          <w:rFonts w:cs="Arial"/>
-          <w:szCs w:val="24"/>
-        </w:rPr>
-      </w:pPr>
-    </w:p>
-    <w:p>
-      <w:pPr>
-        <w:ind w:firstLine="0"/>
-        <w:jc w:val="both"/>
-        <w:rPr>
-          <w:rFonts w:cs="Arial"/>
-          <w:szCs w:val="24"/>
-        </w:rPr>
-      </w:pPr>
-      <w:r>
-        <w:rPr>
-          <w:rFonts w:cs="Arial"/>
-          <w:b/>
-          <w:bCs/>
-          <w:szCs w:val="24"/>
-        </w:rPr>
-        <w:t xml:space="preserve">RN002 – </w:t>
-      </w:r>
-    </w:p>
-    <w:p>
-      <w:pPr>
-        <w:ind w:firstLine="0"/>
-        <w:jc w:val="both"/>
-        <w:rPr>
-          <w:rFonts w:cs="Arial"/>
-          <w:szCs w:val="24"/>
-        </w:rPr>
-      </w:pPr>
-    </w:p>
-    <w:p>
-      <w:pPr>
-        <w:ind w:firstLine="0"/>
-        <w:jc w:val="both"/>
-        <w:rPr>
-          <w:rFonts w:cs="Arial"/>
-          <w:szCs w:val="24"/>
-        </w:rPr>
-      </w:pPr>
-      <w:r>
-        <w:rPr>
-          <w:rFonts w:cs="Arial"/>
-          <w:b/>
-          <w:bCs/>
-          <w:szCs w:val="24"/>
-        </w:rPr>
-        <w:t xml:space="preserve">RN003 – </w:t>
-      </w:r>
-    </w:p>
-    <w:p>
-      <w:pPr>
-        <w:ind w:firstLine="0"/>
-        <w:jc w:val="both"/>
-        <w:rPr>
-          <w:rFonts w:cs="Arial"/>
-          <w:szCs w:val="24"/>
-        </w:rPr>
-      </w:pPr>
-    </w:p>
-    <w:p>
-      <w:pPr>
-        <w:ind w:firstLine="0"/>
-        <w:jc w:val="both"/>
-        <w:rPr>
-          <w:rFonts w:cs="Arial"/>
-          <w:szCs w:val="24"/>
-        </w:rPr>
-      </w:pPr>
-      <w:r>
-        <w:rPr>
-          <w:rFonts w:cs="Arial"/>
-          <w:b/>
-          <w:bCs/>
-          <w:szCs w:val="24"/>
-        </w:rPr>
-        <w:t xml:space="preserve">RN004 – </w:t>
       </w:r>
     </w:p>
     <w:p>
@@ -1871,7 +1758,6 @@
           <w:bCs/>
           <w:szCs w:val="24"/>
         </w:rPr>
-        <w:lastRenderedPageBreak/>
         <w:t xml:space="preserve">Saídas:  </w:t>
       </w:r>
     </w:p>
@@ -2129,6 +2015,7 @@
           <w:bCs/>
           <w:szCs w:val="24"/>
         </w:rPr>
+        <w:lastRenderedPageBreak/>
         <w:t>RF002 – Cadastrar Médico</w:t>
       </w:r>
     </w:p>
@@ -2598,7 +2485,6 @@
           <w:rFonts w:cs="Arial"/>
           <w:szCs w:val="24"/>
         </w:rPr>
-        <w:lastRenderedPageBreak/>
         <w:t>E-mail ou CRM já estiverem vinculados a outra conta no sistema.</w:t>
       </w:r>
     </w:p>
@@ -2776,6 +2662,7 @@
           <w:bCs/>
           <w:szCs w:val="24"/>
         </w:rPr>
+        <w:lastRenderedPageBreak/>
         <w:t>Descrição:</w:t>
       </w:r>
       <w:r>
@@ -3405,7 +3292,6 @@
           <w:bCs/>
           <w:szCs w:val="24"/>
         </w:rPr>
-        <w:lastRenderedPageBreak/>
         <w:t>E-mail</w:t>
       </w:r>
       <w:r>
@@ -3615,6 +3501,7 @@
           <w:bCs/>
           <w:szCs w:val="24"/>
         </w:rPr>
+        <w:lastRenderedPageBreak/>
         <w:t>RF004 –</w:t>
       </w:r>
       <w:r>
@@ -4050,7 +3937,6 @@
           <w:rFonts w:cs="Arial"/>
           <w:szCs w:val="24"/>
         </w:rPr>
-        <w:lastRenderedPageBreak/>
         <w:t xml:space="preserve">Saídas: </w:t>
       </w:r>
     </w:p>
@@ -4213,6 +4099,7 @@
           <w:bCs/>
           <w:szCs w:val="24"/>
         </w:rPr>
+        <w:lastRenderedPageBreak/>
         <w:t xml:space="preserve">Descrição: </w:t>
       </w:r>
       <w:r>
@@ -4702,7 +4589,6 @@
           <w:bCs/>
           <w:szCs w:val="24"/>
         </w:rPr>
-        <w:lastRenderedPageBreak/>
         <w:t xml:space="preserve">Saídas: </w:t>
       </w:r>
     </w:p>
@@ -4864,6 +4750,7 @@
           <w:bCs/>
           <w:szCs w:val="24"/>
         </w:rPr>
+        <w:lastRenderedPageBreak/>
         <w:t>Descrição:</w:t>
       </w:r>
       <w:r>
@@ -8552,6 +8439,7 @@
   <w:style w:type="character" w:default="1" w:styleId="Fontepargpadro">
     <w:name w:val="Default Paragraph Font"/>
     <w:uiPriority w:val="1"/>
+    <w:semiHidden/>
     <w:unhideWhenUsed/>
   </w:style>
   <w:style w:type="table" w:default="1" w:styleId="Tabelanormal">

</xml_diff>